<commit_message>
feat(contest): update all fonts to BiauKai (標楷體) and size to 16pt across all materials
</commit_message>
<xml_diff>
--- a/115校內語文競賽/四年丙班_各項目培訓資料庫/02_作文組/老師_指導指引與每日進度表(含評量標準).docx
+++ b/115校內語文競賽/四年丙班_各項目培訓資料庫/02_作文組/老師_指導指引與每日進度表(含評量標準).docx
@@ -9,11 +9,11 @@
       </w:pPr>
       <w:r>
         <w:rPr>
-          <w:rFonts w:ascii="微軟正黑體" w:hAnsi="微軟正黑體" w:eastAsia="微軟正黑體"/>
+          <w:rFonts w:ascii="標楷體" w:hAnsi="標楷體" w:eastAsia="標楷體"/>
           <w:b/>
           <w:i w:val="0"/>
           <w:color w:val="0F2C59"/>
-          <w:sz w:val="30"/>
+          <w:sz w:val="32"/>
         </w:rPr>
         <w:t>臺中市梧棲區中正國小 115 學年度校內語文競賽</w:t>
       </w:r>
@@ -25,11 +25,11 @@
       </w:pPr>
       <w:r>
         <w:rPr>
-          <w:rFonts w:ascii="微軟正黑體" w:hAnsi="微軟正黑體" w:eastAsia="微軟正黑體"/>
+          <w:rFonts w:ascii="標楷體" w:hAnsi="標楷體" w:eastAsia="標楷體"/>
           <w:b/>
           <w:i w:val="0"/>
           <w:color w:val="C2410C"/>
-          <w:sz w:val="22"/>
+          <w:sz w:val="32"/>
         </w:rPr>
         <w:t>【四年丙班・作文組】老師指導指引與進度表（含週末自學增量全排程）</w:t>
       </w:r>
@@ -41,11 +41,11 @@
       </w:pPr>
       <w:r>
         <w:rPr>
-          <w:rFonts w:ascii="微軟正黑體" w:hAnsi="微軟正黑體" w:eastAsia="微軟正黑體"/>
+          <w:rFonts w:ascii="標楷體" w:hAnsi="標楷體" w:eastAsia="標楷體"/>
           <w:b/>
           <w:i w:val="0"/>
           <w:color w:val="0F2C59"/>
-          <w:sz w:val="26"/>
+          <w:sz w:val="32"/>
         </w:rPr>
         <w:t>壹、競賽核心規範與評判規準</w:t>
       </w:r>
@@ -57,21 +57,21 @@
       </w:pPr>
       <w:r>
         <w:rPr>
-          <w:rFonts w:ascii="微軟正黑體" w:hAnsi="微軟正黑體" w:eastAsia="微軟正黑體"/>
+          <w:rFonts w:ascii="標楷體" w:hAnsi="標楷體" w:eastAsia="標楷體"/>
           <w:b/>
           <w:i w:val="0"/>
           <w:color w:val="1E293B"/>
-          <w:sz w:val="19"/>
+          <w:sz w:val="32"/>
         </w:rPr>
         <w:t>時間地點：</w:t>
       </w:r>
       <w:r>
         <w:rPr>
-          <w:rFonts w:ascii="微軟正黑體" w:hAnsi="微軟正黑體" w:eastAsia="微軟正黑體"/>
+          <w:rFonts w:ascii="標楷體" w:hAnsi="標楷體" w:eastAsia="標楷體"/>
           <w:b w:val="0"/>
           <w:i w:val="0"/>
           <w:color w:val="334155"/>
-          <w:sz w:val="19"/>
+          <w:sz w:val="32"/>
         </w:rPr>
         <w:t>115 年 11 月 5 日（四）08:20 - 09:50（限時 90 分鐘，美勞教室二）。</w:t>
       </w:r>
@@ -83,21 +83,21 @@
       </w:pPr>
       <w:r>
         <w:rPr>
-          <w:rFonts w:ascii="微軟正黑體" w:hAnsi="微軟正黑體" w:eastAsia="微軟正黑體"/>
+          <w:rFonts w:ascii="標楷體" w:hAnsi="標楷體" w:eastAsia="標楷體"/>
           <w:b/>
           <w:i w:val="0"/>
           <w:color w:val="1E293B"/>
-          <w:sz w:val="19"/>
+          <w:sz w:val="32"/>
         </w:rPr>
         <w:t>評判規準：</w:t>
       </w:r>
       <w:r>
         <w:rPr>
-          <w:rFonts w:ascii="微軟正黑體" w:hAnsi="微軟正黑體" w:eastAsia="微軟正黑體"/>
+          <w:rFonts w:ascii="標楷體" w:hAnsi="標楷體" w:eastAsia="標楷體"/>
           <w:b w:val="0"/>
           <w:i w:val="0"/>
           <w:color w:val="334155"/>
-          <w:sz w:val="19"/>
+          <w:sz w:val="32"/>
         </w:rPr>
         <w:t>字數限制 600~800 字，立意取材 40%、組織結構 30%、字詞修辭 20%、標點書寫 10%。</w:t>
       </w:r>
@@ -109,21 +109,21 @@
       </w:pPr>
       <w:r>
         <w:rPr>
-          <w:rFonts w:ascii="微軟正黑體" w:hAnsi="微軟正黑體" w:eastAsia="微軟正黑體"/>
+          <w:rFonts w:ascii="標楷體" w:hAnsi="標楷體" w:eastAsia="標楷體"/>
           <w:b/>
           <w:i w:val="0"/>
           <w:color w:val="1E293B"/>
-          <w:sz w:val="19"/>
+          <w:sz w:val="32"/>
         </w:rPr>
         <w:t>假日自學增量機制：</w:t>
       </w:r>
       <w:r>
         <w:rPr>
-          <w:rFonts w:ascii="微軟正黑體" w:hAnsi="微軟正黑體" w:eastAsia="微軟正黑體"/>
+          <w:rFonts w:ascii="標楷體" w:hAnsi="標楷體" w:eastAsia="標楷體"/>
           <w:b w:val="0"/>
           <w:i w:val="0"/>
           <w:color w:val="334155"/>
-          <w:sz w:val="19"/>
+          <w:sz w:val="32"/>
         </w:rPr>
         <w:t>遇到週末假日改為居家自主自學與作業增量（300~600字長篇練筆），週一晨間統一批閱。</w:t>
       </w:r>
@@ -135,11 +135,11 @@
       </w:pPr>
       <w:r>
         <w:rPr>
-          <w:rFonts w:ascii="微軟正黑體" w:hAnsi="微軟正黑體" w:eastAsia="微軟正黑體"/>
+          <w:rFonts w:ascii="標楷體" w:hAnsi="標楷體" w:eastAsia="標楷體"/>
           <w:b/>
           <w:i w:val="0"/>
           <w:color w:val="0F2C59"/>
-          <w:sz w:val="26"/>
+          <w:sz w:val="32"/>
         </w:rPr>
         <w:t>貳、10/5~10/30 每日集訓與週末自學增量進度評量表</w:t>
       </w:r>
@@ -187,11 +187,11 @@
             </w:pPr>
             <w:r>
               <w:rPr>
-                <w:rFonts w:ascii="微軟正黑體" w:hAnsi="微軟正黑體" w:eastAsia="微軟正黑體"/>
+                <w:rFonts w:ascii="標楷體" w:hAnsi="標楷體" w:eastAsia="標楷體"/>
                 <w:b/>
                 <w:i w:val="0"/>
                 <w:color w:val="FFFFFF"/>
-                <w:sz w:val="18"/>
+                <w:sz w:val="32"/>
               </w:rPr>
               <w:t>天數/週末</w:t>
             </w:r>
@@ -216,11 +216,11 @@
             </w:pPr>
             <w:r>
               <w:rPr>
-                <w:rFonts w:ascii="微軟正黑體" w:hAnsi="微軟正黑體" w:eastAsia="微軟正黑體"/>
+                <w:rFonts w:ascii="標楷體" w:hAnsi="標楷體" w:eastAsia="標楷體"/>
                 <w:b/>
                 <w:i w:val="0"/>
                 <w:color w:val="FFFFFF"/>
-                <w:sz w:val="18"/>
+                <w:sz w:val="32"/>
               </w:rPr>
               <w:t>日期</w:t>
             </w:r>
@@ -245,11 +245,11 @@
             </w:pPr>
             <w:r>
               <w:rPr>
-                <w:rFonts w:ascii="微軟正黑體" w:hAnsi="微軟正黑體" w:eastAsia="微軟正黑體"/>
+                <w:rFonts w:ascii="標楷體" w:hAnsi="標楷體" w:eastAsia="標楷體"/>
                 <w:b/>
                 <w:i w:val="0"/>
                 <w:color w:val="FFFFFF"/>
-                <w:sz w:val="18"/>
+                <w:sz w:val="32"/>
               </w:rPr>
               <w:t>性質</w:t>
             </w:r>
@@ -274,11 +274,11 @@
             </w:pPr>
             <w:r>
               <w:rPr>
-                <w:rFonts w:ascii="微軟正黑體" w:hAnsi="微軟正黑體" w:eastAsia="微軟正黑體"/>
+                <w:rFonts w:ascii="標楷體" w:hAnsi="標楷體" w:eastAsia="標楷體"/>
                 <w:b/>
                 <w:i w:val="0"/>
                 <w:color w:val="FFFFFF"/>
-                <w:sz w:val="18"/>
+                <w:sz w:val="32"/>
               </w:rPr>
               <w:t>核心技巧/任務</w:t>
             </w:r>
@@ -303,11 +303,11 @@
             </w:pPr>
             <w:r>
               <w:rPr>
-                <w:rFonts w:ascii="微軟正黑體" w:hAnsi="微軟正黑體" w:eastAsia="微軟正黑體"/>
+                <w:rFonts w:ascii="標楷體" w:hAnsi="標楷體" w:eastAsia="標楷體"/>
                 <w:b/>
                 <w:i w:val="0"/>
                 <w:color w:val="FFFFFF"/>
-                <w:sz w:val="18"/>
+                <w:sz w:val="32"/>
               </w:rPr>
               <w:t>在校教學重點／週末自學指引</w:t>
             </w:r>
@@ -332,11 +332,11 @@
             </w:pPr>
             <w:r>
               <w:rPr>
-                <w:rFonts w:ascii="微軟正黑體" w:hAnsi="微軟正黑體" w:eastAsia="微軟正黑體"/>
+                <w:rFonts w:ascii="標楷體" w:hAnsi="標楷體" w:eastAsia="標楷體"/>
                 <w:b/>
                 <w:i w:val="0"/>
                 <w:color w:val="FFFFFF"/>
-                <w:sz w:val="18"/>
+                <w:sz w:val="32"/>
               </w:rPr>
               <w:t>評量指標規準</w:t>
             </w:r>
@@ -361,11 +361,11 @@
             </w:pPr>
             <w:r>
               <w:rPr>
-                <w:rFonts w:ascii="微軟正黑體" w:hAnsi="微軟正黑體" w:eastAsia="微軟正黑體"/>
+                <w:rFonts w:ascii="標楷體" w:hAnsi="標楷體" w:eastAsia="標楷體"/>
                 <w:b/>
                 <w:i w:val="0"/>
                 <w:color w:val="FFFFFF"/>
-                <w:sz w:val="18"/>
+                <w:sz w:val="32"/>
               </w:rPr>
               <w:t>導師評核</w:t>
             </w:r>
@@ -392,11 +392,11 @@
             </w:pPr>
             <w:r>
               <w:rPr>
-                <w:rFonts w:ascii="微軟正黑體" w:hAnsi="微軟正黑體" w:eastAsia="微軟正黑體"/>
+                <w:rFonts w:ascii="標楷體" w:hAnsi="標楷體" w:eastAsia="標楷體"/>
                 <w:b/>
                 <w:i w:val="0"/>
                 <w:color w:val="1E293B"/>
-                <w:sz w:val="17"/>
+                <w:sz w:val="32"/>
               </w:rPr>
               <w:t>Day 01</w:t>
             </w:r>
@@ -421,11 +421,11 @@
             </w:pPr>
             <w:r>
               <w:rPr>
-                <w:rFonts w:ascii="微軟正黑體" w:hAnsi="微軟正黑體" w:eastAsia="微軟正黑體"/>
+                <w:rFonts w:ascii="標楷體" w:hAnsi="標楷體" w:eastAsia="標楷體"/>
                 <w:b w:val="0"/>
                 <w:i w:val="0"/>
                 <w:color w:val="1E293B"/>
-                <w:sz w:val="17"/>
+                <w:sz w:val="32"/>
               </w:rPr>
               <w:t>10/05 (一)</w:t>
             </w:r>
@@ -450,11 +450,11 @@
             </w:pPr>
             <w:r>
               <w:rPr>
-                <w:rFonts w:ascii="微軟正黑體" w:hAnsi="微軟正黑體" w:eastAsia="微軟正黑體"/>
+                <w:rFonts w:ascii="標楷體" w:hAnsi="標楷體" w:eastAsia="標楷體"/>
                 <w:b w:val="0"/>
                 <w:i w:val="0"/>
                 <w:color w:val="1E293B"/>
-                <w:sz w:val="17"/>
+                <w:sz w:val="32"/>
               </w:rPr>
               <w:t>在校集訓</w:t>
             </w:r>
@@ -479,11 +479,11 @@
             </w:pPr>
             <w:r>
               <w:rPr>
-                <w:rFonts w:ascii="微軟正黑體" w:hAnsi="微軟正黑體" w:eastAsia="微軟正黑體"/>
+                <w:rFonts w:ascii="標楷體" w:hAnsi="標楷體" w:eastAsia="標楷體"/>
                 <w:b w:val="0"/>
                 <w:i w:val="0"/>
                 <w:color w:val="1E293B"/>
-                <w:sz w:val="17"/>
+                <w:sz w:val="32"/>
               </w:rPr>
               <w:t>審題核心：抓出題眼與六何要素...</w:t>
             </w:r>
@@ -508,11 +508,11 @@
             </w:pPr>
             <w:r>
               <w:rPr>
-                <w:rFonts w:ascii="微軟正黑體" w:hAnsi="微軟正黑體" w:eastAsia="微軟正黑體"/>
+                <w:rFonts w:ascii="標楷體" w:hAnsi="標楷體" w:eastAsia="標楷體"/>
                 <w:b w:val="0"/>
                 <w:i w:val="0"/>
                 <w:color w:val="1E293B"/>
-                <w:sz w:val="17"/>
+                <w:sz w:val="32"/>
               </w:rPr>
               <w:t>指導審題技巧：辨識題目類型（寫人/記事/寫景）。拆解題眼，抓出「何人、何事、何時、何地、何因、何果」。以題目〈一件讓我感動的事〉示範審題思維。</w:t>
             </w:r>
@@ -537,11 +537,11 @@
             </w:pPr>
             <w:r>
               <w:rPr>
-                <w:rFonts w:ascii="微軟正黑體" w:hAnsi="微軟正黑體" w:eastAsia="微軟正黑體"/>
+                <w:rFonts w:ascii="標楷體" w:hAnsi="標楷體" w:eastAsia="標楷體"/>
                 <w:b w:val="0"/>
                 <w:i w:val="0"/>
                 <w:color w:val="1E293B"/>
-                <w:sz w:val="17"/>
+                <w:sz w:val="32"/>
               </w:rPr>
               <w:t>能精準圈出題目的核心限制詞與情感基調，列出 3 個備選真實生活素材。</w:t>
             </w:r>
@@ -566,11 +566,11 @@
             </w:pPr>
             <w:r>
               <w:rPr>
-                <w:rFonts w:ascii="微軟正黑體" w:hAnsi="微軟正黑體" w:eastAsia="微軟正黑體"/>
+                <w:rFonts w:ascii="標楷體" w:hAnsi="標楷體" w:eastAsia="標楷體"/>
                 <w:b w:val="0"/>
                 <w:i w:val="0"/>
                 <w:color w:val="1E293B"/>
-                <w:sz w:val="17"/>
+                <w:sz w:val="32"/>
               </w:rPr>
               <w:t>［ ］優</w:t>
               <w:br/>
@@ -598,11 +598,11 @@
             </w:pPr>
             <w:r>
               <w:rPr>
-                <w:rFonts w:ascii="微軟正黑體" w:hAnsi="微軟正黑體" w:eastAsia="微軟正黑體"/>
+                <w:rFonts w:ascii="標楷體" w:hAnsi="標楷體" w:eastAsia="標楷體"/>
                 <w:b/>
                 <w:i w:val="0"/>
                 <w:color w:val="1E293B"/>
-                <w:sz w:val="17"/>
+                <w:sz w:val="32"/>
               </w:rPr>
               <w:t>Day 02</w:t>
             </w:r>
@@ -626,11 +626,11 @@
             </w:pPr>
             <w:r>
               <w:rPr>
-                <w:rFonts w:ascii="微軟正黑體" w:hAnsi="微軟正黑體" w:eastAsia="微軟正黑體"/>
+                <w:rFonts w:ascii="標楷體" w:hAnsi="標楷體" w:eastAsia="標楷體"/>
                 <w:b w:val="0"/>
                 <w:i w:val="0"/>
                 <w:color w:val="1E293B"/>
-                <w:sz w:val="17"/>
+                <w:sz w:val="32"/>
               </w:rPr>
               <w:t>10/06 (二)</w:t>
             </w:r>
@@ -654,11 +654,11 @@
             </w:pPr>
             <w:r>
               <w:rPr>
-                <w:rFonts w:ascii="微軟正黑體" w:hAnsi="微軟正黑體" w:eastAsia="微軟正黑體"/>
+                <w:rFonts w:ascii="標楷體" w:hAnsi="標楷體" w:eastAsia="標楷體"/>
                 <w:b w:val="0"/>
                 <w:i w:val="0"/>
                 <w:color w:val="1E293B"/>
-                <w:sz w:val="17"/>
+                <w:sz w:val="32"/>
               </w:rPr>
               <w:t>在校集訓</w:t>
             </w:r>
@@ -682,11 +682,11 @@
             </w:pPr>
             <w:r>
               <w:rPr>
-                <w:rFonts w:ascii="微軟正黑體" w:hAnsi="微軟正黑體" w:eastAsia="微軟正黑體"/>
+                <w:rFonts w:ascii="標楷體" w:hAnsi="標楷體" w:eastAsia="標楷體"/>
                 <w:b w:val="0"/>
                 <w:i w:val="0"/>
                 <w:color w:val="1E293B"/>
-                <w:sz w:val="17"/>
+                <w:sz w:val="32"/>
               </w:rPr>
               <w:t>第一段破題法 A：開門見山法...</w:t>
             </w:r>
@@ -710,11 +710,11 @@
             </w:pPr>
             <w:r>
               <w:rPr>
-                <w:rFonts w:ascii="微軟正黑體" w:hAnsi="微軟正黑體" w:eastAsia="微軟正黑體"/>
+                <w:rFonts w:ascii="標楷體" w:hAnsi="標楷體" w:eastAsia="標楷體"/>
                 <w:b w:val="0"/>
                 <w:i w:val="0"/>
                 <w:color w:val="1E293B"/>
-                <w:sz w:val="17"/>
+                <w:sz w:val="32"/>
               </w:rPr>
               <w:t>講解開門見山法：不繞圈子，在第一句話直接點明文章主題與核心情感，簡潔有力，讓閱卷老師一眼看見主旨。</w:t>
             </w:r>
@@ -738,11 +738,11 @@
             </w:pPr>
             <w:r>
               <w:rPr>
-                <w:rFonts w:ascii="微軟正黑體" w:hAnsi="微軟正黑體" w:eastAsia="微軟正黑體"/>
+                <w:rFonts w:ascii="標楷體" w:hAnsi="標楷體" w:eastAsia="標楷體"/>
                 <w:b w:val="0"/>
                 <w:i w:val="0"/>
                 <w:color w:val="1E293B"/>
-                <w:sz w:val="17"/>
+                <w:sz w:val="32"/>
               </w:rPr>
               <w:t>首段 60~80 字，在第 1~2 句直接點出事件主題，語句通順，不拖泥帶水。</w:t>
             </w:r>
@@ -766,11 +766,11 @@
             </w:pPr>
             <w:r>
               <w:rPr>
-                <w:rFonts w:ascii="微軟正黑體" w:hAnsi="微軟正黑體" w:eastAsia="微軟正黑體"/>
+                <w:rFonts w:ascii="標楷體" w:hAnsi="標楷體" w:eastAsia="標楷體"/>
                 <w:b w:val="0"/>
                 <w:i w:val="0"/>
                 <w:color w:val="1E293B"/>
-                <w:sz w:val="17"/>
+                <w:sz w:val="32"/>
               </w:rPr>
               <w:t>［ ］優</w:t>
               <w:br/>
@@ -799,11 +799,11 @@
             </w:pPr>
             <w:r>
               <w:rPr>
-                <w:rFonts w:ascii="微軟正黑體" w:hAnsi="微軟正黑體" w:eastAsia="微軟正黑體"/>
+                <w:rFonts w:ascii="標楷體" w:hAnsi="標楷體" w:eastAsia="標楷體"/>
                 <w:b/>
                 <w:i w:val="0"/>
                 <w:color w:val="1E293B"/>
-                <w:sz w:val="17"/>
+                <w:sz w:val="32"/>
               </w:rPr>
               <w:t>Day 03</w:t>
             </w:r>
@@ -828,11 +828,11 @@
             </w:pPr>
             <w:r>
               <w:rPr>
-                <w:rFonts w:ascii="微軟正黑體" w:hAnsi="微軟正黑體" w:eastAsia="微軟正黑體"/>
+                <w:rFonts w:ascii="標楷體" w:hAnsi="標楷體" w:eastAsia="標楷體"/>
                 <w:b w:val="0"/>
                 <w:i w:val="0"/>
                 <w:color w:val="1E293B"/>
-                <w:sz w:val="17"/>
+                <w:sz w:val="32"/>
               </w:rPr>
               <w:t>10/07 (三)</w:t>
             </w:r>
@@ -857,11 +857,11 @@
             </w:pPr>
             <w:r>
               <w:rPr>
-                <w:rFonts w:ascii="微軟正黑體" w:hAnsi="微軟正黑體" w:eastAsia="微軟正黑體"/>
+                <w:rFonts w:ascii="標楷體" w:hAnsi="標楷體" w:eastAsia="標楷體"/>
                 <w:b w:val="0"/>
                 <w:i w:val="0"/>
                 <w:color w:val="1E293B"/>
-                <w:sz w:val="17"/>
+                <w:sz w:val="32"/>
               </w:rPr>
               <w:t>在校集訓</w:t>
             </w:r>
@@ -886,11 +886,11 @@
             </w:pPr>
             <w:r>
               <w:rPr>
-                <w:rFonts w:ascii="微軟正黑體" w:hAnsi="微軟正黑體" w:eastAsia="微軟正黑體"/>
+                <w:rFonts w:ascii="標楷體" w:hAnsi="標楷體" w:eastAsia="標楷體"/>
                 <w:b w:val="0"/>
                 <w:i w:val="0"/>
                 <w:color w:val="1E293B"/>
-                <w:sz w:val="17"/>
+                <w:sz w:val="32"/>
               </w:rPr>
               <w:t>第一段破題法 B：情境渲染法...</w:t>
             </w:r>
@@ -915,11 +915,11 @@
             </w:pPr>
             <w:r>
               <w:rPr>
-                <w:rFonts w:ascii="微軟正黑體" w:hAnsi="微軟正黑體" w:eastAsia="微軟正黑體"/>
+                <w:rFonts w:ascii="標楷體" w:hAnsi="標楷體" w:eastAsia="標楷體"/>
                 <w:b w:val="0"/>
                 <w:i w:val="0"/>
                 <w:color w:val="1E293B"/>
-                <w:sz w:val="17"/>
+                <w:sz w:val="32"/>
               </w:rPr>
               <w:t>講解情境渲染法：從特定的天氣、環境、聲音或氣味切入，烘托氛圍，營造電影鏡頭般的臨場感，再引出回憶。</w:t>
             </w:r>
@@ -944,11 +944,11 @@
             </w:pPr>
             <w:r>
               <w:rPr>
-                <w:rFonts w:ascii="微軟正黑體" w:hAnsi="微軟正黑體" w:eastAsia="微軟正黑體"/>
+                <w:rFonts w:ascii="標楷體" w:hAnsi="標楷體" w:eastAsia="標楷體"/>
                 <w:b w:val="0"/>
                 <w:i w:val="0"/>
                 <w:color w:val="1E293B"/>
-                <w:sz w:val="17"/>
+                <w:sz w:val="32"/>
               </w:rPr>
               <w:t>能靈活運用環境細節（天氣、聲音）烘托氣氛，自然導入主題，文字富有美感。</w:t>
             </w:r>
@@ -973,11 +973,11 @@
             </w:pPr>
             <w:r>
               <w:rPr>
-                <w:rFonts w:ascii="微軟正黑體" w:hAnsi="微軟正黑體" w:eastAsia="微軟正黑體"/>
+                <w:rFonts w:ascii="標楷體" w:hAnsi="標楷體" w:eastAsia="標楷體"/>
                 <w:b w:val="0"/>
                 <w:i w:val="0"/>
                 <w:color w:val="1E293B"/>
-                <w:sz w:val="17"/>
+                <w:sz w:val="32"/>
               </w:rPr>
               <w:t>［ ］優</w:t>
               <w:br/>
@@ -1005,11 +1005,11 @@
             </w:pPr>
             <w:r>
               <w:rPr>
-                <w:rFonts w:ascii="微軟正黑體" w:hAnsi="微軟正黑體" w:eastAsia="微軟正黑體"/>
+                <w:rFonts w:ascii="標楷體" w:hAnsi="標楷體" w:eastAsia="標楷體"/>
                 <w:b/>
                 <w:i w:val="0"/>
                 <w:color w:val="1E293B"/>
-                <w:sz w:val="17"/>
+                <w:sz w:val="32"/>
               </w:rPr>
               <w:t>Day 04</w:t>
             </w:r>
@@ -1033,11 +1033,11 @@
             </w:pPr>
             <w:r>
               <w:rPr>
-                <w:rFonts w:ascii="微軟正黑體" w:hAnsi="微軟正黑體" w:eastAsia="微軟正黑體"/>
+                <w:rFonts w:ascii="標楷體" w:hAnsi="標楷體" w:eastAsia="標楷體"/>
                 <w:b w:val="0"/>
                 <w:i w:val="0"/>
                 <w:color w:val="1E293B"/>
-                <w:sz w:val="17"/>
+                <w:sz w:val="32"/>
               </w:rPr>
               <w:t>10/08 (四)</w:t>
             </w:r>
@@ -1061,11 +1061,11 @@
             </w:pPr>
             <w:r>
               <w:rPr>
-                <w:rFonts w:ascii="微軟正黑體" w:hAnsi="微軟正黑體" w:eastAsia="微軟正黑體"/>
+                <w:rFonts w:ascii="標楷體" w:hAnsi="標楷體" w:eastAsia="標楷體"/>
                 <w:b w:val="0"/>
                 <w:i w:val="0"/>
                 <w:color w:val="1E293B"/>
-                <w:sz w:val="17"/>
+                <w:sz w:val="32"/>
               </w:rPr>
               <w:t>在校集訓</w:t>
             </w:r>
@@ -1089,11 +1089,11 @@
             </w:pPr>
             <w:r>
               <w:rPr>
-                <w:rFonts w:ascii="微軟正黑體" w:hAnsi="微軟正黑體" w:eastAsia="微軟正黑體"/>
+                <w:rFonts w:ascii="標楷體" w:hAnsi="標楷體" w:eastAsia="標楷體"/>
                 <w:b w:val="0"/>
                 <w:i w:val="0"/>
                 <w:color w:val="1E293B"/>
-                <w:sz w:val="17"/>
+                <w:sz w:val="32"/>
               </w:rPr>
               <w:t>第一段破題法 C：設問引入法...</w:t>
             </w:r>
@@ -1117,11 +1117,11 @@
             </w:pPr>
             <w:r>
               <w:rPr>
-                <w:rFonts w:ascii="微軟正黑體" w:hAnsi="微軟正黑體" w:eastAsia="微軟正黑體"/>
+                <w:rFonts w:ascii="標楷體" w:hAnsi="標楷體" w:eastAsia="標楷體"/>
                 <w:b w:val="0"/>
                 <w:i w:val="0"/>
                 <w:color w:val="1E293B"/>
-                <w:sz w:val="17"/>
+                <w:sz w:val="32"/>
               </w:rPr>
               <w:t>講解設問引入法：以一個富有深意的疑問句或反問句作為開篇，激發讀者的好奇心，隨後給予回答，帶出文章主旨。</w:t>
             </w:r>
@@ -1145,11 +1145,11 @@
             </w:pPr>
             <w:r>
               <w:rPr>
-                <w:rFonts w:ascii="微軟正黑體" w:hAnsi="微軟正黑體" w:eastAsia="微軟正黑體"/>
+                <w:rFonts w:ascii="標楷體" w:hAnsi="標楷體" w:eastAsia="標楷體"/>
                 <w:b w:val="0"/>
                 <w:i w:val="0"/>
                 <w:color w:val="1E293B"/>
-                <w:sz w:val="17"/>
+                <w:sz w:val="32"/>
               </w:rPr>
               <w:t>提問具備啟發性與吸引力，設問與自答銜接自然，首段長度適中（約80字）。</w:t>
             </w:r>
@@ -1173,11 +1173,11 @@
             </w:pPr>
             <w:r>
               <w:rPr>
-                <w:rFonts w:ascii="微軟正黑體" w:hAnsi="微軟正黑體" w:eastAsia="微軟正黑體"/>
+                <w:rFonts w:ascii="標楷體" w:hAnsi="標楷體" w:eastAsia="標楷體"/>
                 <w:b w:val="0"/>
                 <w:i w:val="0"/>
                 <w:color w:val="1E293B"/>
-                <w:sz w:val="17"/>
+                <w:sz w:val="32"/>
               </w:rPr>
               <w:t>［ ］優</w:t>
               <w:br/>
@@ -1206,11 +1206,11 @@
             </w:pPr>
             <w:r>
               <w:rPr>
-                <w:rFonts w:ascii="微軟正黑體" w:hAnsi="微軟正黑體" w:eastAsia="微軟正黑體"/>
+                <w:rFonts w:ascii="標楷體" w:hAnsi="標楷體" w:eastAsia="標楷體"/>
                 <w:b/>
                 <w:i w:val="0"/>
                 <w:color w:val="1E293B"/>
-                <w:sz w:val="17"/>
+                <w:sz w:val="32"/>
               </w:rPr>
               <w:t>Day 05</w:t>
             </w:r>
@@ -1235,11 +1235,11 @@
             </w:pPr>
             <w:r>
               <w:rPr>
-                <w:rFonts w:ascii="微軟正黑體" w:hAnsi="微軟正黑體" w:eastAsia="微軟正黑體"/>
+                <w:rFonts w:ascii="標楷體" w:hAnsi="標楷體" w:eastAsia="標楷體"/>
                 <w:b w:val="0"/>
                 <w:i w:val="0"/>
                 <w:color w:val="1E293B"/>
-                <w:sz w:val="17"/>
+                <w:sz w:val="32"/>
               </w:rPr>
               <w:t>10/09 (五)</w:t>
             </w:r>
@@ -1264,11 +1264,11 @@
             </w:pPr>
             <w:r>
               <w:rPr>
-                <w:rFonts w:ascii="微軟正黑體" w:hAnsi="微軟正黑體" w:eastAsia="微軟正黑體"/>
+                <w:rFonts w:ascii="標楷體" w:hAnsi="標楷體" w:eastAsia="標楷體"/>
                 <w:b w:val="0"/>
                 <w:i w:val="0"/>
                 <w:color w:val="1E293B"/>
-                <w:sz w:val="17"/>
+                <w:sz w:val="32"/>
               </w:rPr>
               <w:t>在校集訓</w:t>
             </w:r>
@@ -1293,11 +1293,11 @@
             </w:pPr>
             <w:r>
               <w:rPr>
-                <w:rFonts w:ascii="微軟正黑體" w:hAnsi="微軟正黑體" w:eastAsia="微軟正黑體"/>
+                <w:rFonts w:ascii="標楷體" w:hAnsi="標楷體" w:eastAsia="標楷體"/>
                 <w:b w:val="0"/>
                 <w:i w:val="0"/>
                 <w:color w:val="1E293B"/>
-                <w:sz w:val="17"/>
+                <w:sz w:val="32"/>
               </w:rPr>
               <w:t>第一段綜合實戰與第 1 週週...</w:t>
             </w:r>
@@ -1322,11 +1322,11 @@
             </w:pPr>
             <w:r>
               <w:rPr>
-                <w:rFonts w:ascii="微軟正黑體" w:hAnsi="微軟正黑體" w:eastAsia="微軟正黑體"/>
+                <w:rFonts w:ascii="標楷體" w:hAnsi="標楷體" w:eastAsia="標楷體"/>
                 <w:b w:val="0"/>
                 <w:i w:val="0"/>
                 <w:color w:val="1E293B"/>
-                <w:sz w:val="17"/>
+                <w:sz w:val="32"/>
               </w:rPr>
               <w:t>第 1 週首段總結：現場給予題目〈校園裡最熱鬧的時刻〉，限時 15 分鐘，自主選擇最合適的破題法完成 100 字首段。</w:t>
             </w:r>
@@ -1351,11 +1351,11 @@
             </w:pPr>
             <w:r>
               <w:rPr>
-                <w:rFonts w:ascii="微軟正黑體" w:hAnsi="微軟正黑體" w:eastAsia="微軟正黑體"/>
+                <w:rFonts w:ascii="標楷體" w:hAnsi="標楷體" w:eastAsia="標楷體"/>
                 <w:b w:val="0"/>
                 <w:i w:val="0"/>
                 <w:color w:val="1E293B"/>
-                <w:sz w:val="17"/>
+                <w:sz w:val="32"/>
               </w:rPr>
               <w:t>能在 15 分鐘內獨立完成高品質首段，字數達 80~100 字，標點正確，引人入勝。</w:t>
             </w:r>
@@ -1380,11 +1380,11 @@
             </w:pPr>
             <w:r>
               <w:rPr>
-                <w:rFonts w:ascii="微軟正黑體" w:hAnsi="微軟正黑體" w:eastAsia="微軟正黑體"/>
+                <w:rFonts w:ascii="標楷體" w:hAnsi="標楷體" w:eastAsia="標楷體"/>
                 <w:b w:val="0"/>
                 <w:i w:val="0"/>
                 <w:color w:val="1E293B"/>
-                <w:sz w:val="17"/>
+                <w:sz w:val="32"/>
               </w:rPr>
               <w:t>［ ］優</w:t>
               <w:br/>
@@ -1412,11 +1412,11 @@
             </w:pPr>
             <w:r>
               <w:rPr>
-                <w:rFonts w:ascii="微軟正黑體" w:hAnsi="微軟正黑體" w:eastAsia="微軟正黑體"/>
+                <w:rFonts w:ascii="標楷體" w:hAnsi="標楷體" w:eastAsia="標楷體"/>
                 <w:b/>
                 <w:i w:val="0"/>
                 <w:color w:val="1E293B"/>
-                <w:sz w:val="17"/>
+                <w:sz w:val="32"/>
               </w:rPr>
               <w:t>週末假日一</w:t>
             </w:r>
@@ -1440,11 +1440,11 @@
             </w:pPr>
             <w:r>
               <w:rPr>
-                <w:rFonts w:ascii="微軟正黑體" w:hAnsi="微軟正黑體" w:eastAsia="微軟正黑體"/>
+                <w:rFonts w:ascii="標楷體" w:hAnsi="標楷體" w:eastAsia="標楷體"/>
                 <w:b w:val="0"/>
                 <w:i w:val="0"/>
                 <w:color w:val="1E293B"/>
-                <w:sz w:val="17"/>
+                <w:sz w:val="32"/>
               </w:rPr>
               <w:t>10/10 (六) ~ 10/11 (日)</w:t>
             </w:r>
@@ -1468,11 +1468,11 @@
             </w:pPr>
             <w:r>
               <w:rPr>
-                <w:rFonts w:ascii="微軟正黑體" w:hAnsi="微軟正黑體" w:eastAsia="微軟正黑體"/>
+                <w:rFonts w:ascii="標楷體" w:hAnsi="標楷體" w:eastAsia="標楷體"/>
                 <w:b w:val="0"/>
                 <w:i w:val="0"/>
                 <w:color w:val="1E293B"/>
-                <w:sz w:val="17"/>
+                <w:sz w:val="32"/>
               </w:rPr>
               <w:t>假日自學增量</w:t>
             </w:r>
@@ -1496,11 +1496,11 @@
             </w:pPr>
             <w:r>
               <w:rPr>
-                <w:rFonts w:ascii="微軟正黑體" w:hAnsi="微軟正黑體" w:eastAsia="微軟正黑體"/>
+                <w:rFonts w:ascii="標楷體" w:hAnsi="標楷體" w:eastAsia="標楷體"/>
                 <w:b w:val="0"/>
                 <w:i w:val="0"/>
                 <w:color w:val="1E293B"/>
-                <w:sz w:val="17"/>
+                <w:sz w:val="32"/>
               </w:rPr>
               <w:t>【假日自主自學與作業增量】題...</w:t>
             </w:r>
@@ -1524,11 +1524,11 @@
             </w:pPr>
             <w:r>
               <w:rPr>
-                <w:rFonts w:ascii="微軟正黑體" w:hAnsi="微軟正黑體" w:eastAsia="微軟正黑體"/>
+                <w:rFonts w:ascii="標楷體" w:hAnsi="標楷體" w:eastAsia="標楷體"/>
                 <w:b w:val="0"/>
                 <w:i w:val="0"/>
                 <w:color w:val="1E293B"/>
-                <w:sz w:val="17"/>
+                <w:sz w:val="32"/>
               </w:rPr>
               <w:t>【週末停課改居家自學】指派週末寫作增量任務：將前五天所學之審題、破題與承接融會貫通。</w:t>
               <w:br/>
@@ -1554,11 +1554,11 @@
             </w:pPr>
             <w:r>
               <w:rPr>
-                <w:rFonts w:ascii="微軟正黑體" w:hAnsi="微軟正黑體" w:eastAsia="微軟正黑體"/>
+                <w:rFonts w:ascii="標楷體" w:hAnsi="標楷體" w:eastAsia="標楷體"/>
                 <w:b w:val="0"/>
                 <w:i w:val="0"/>
                 <w:color w:val="1E293B"/>
-                <w:sz w:val="17"/>
+                <w:sz w:val="32"/>
               </w:rPr>
               <w:t>【特優】：完成 300 字前兩段寫作 ＋ 摘錄 5 個成語與 2 個佳句；【合格】：按字數規格完成且家長簽章。</w:t>
             </w:r>
@@ -1582,11 +1582,11 @@
             </w:pPr>
             <w:r>
               <w:rPr>
-                <w:rFonts w:ascii="微軟正黑體" w:hAnsi="微軟正黑體" w:eastAsia="微軟正黑體"/>
+                <w:rFonts w:ascii="標楷體" w:hAnsi="標楷體" w:eastAsia="標楷體"/>
                 <w:b w:val="0"/>
                 <w:i w:val="0"/>
                 <w:color w:val="1E293B"/>
-                <w:sz w:val="17"/>
+                <w:sz w:val="32"/>
               </w:rPr>
               <w:t>［ ］優</w:t>
               <w:br/>
@@ -1615,11 +1615,11 @@
             </w:pPr>
             <w:r>
               <w:rPr>
-                <w:rFonts w:ascii="微軟正黑體" w:hAnsi="微軟正黑體" w:eastAsia="微軟正黑體"/>
+                <w:rFonts w:ascii="標楷體" w:hAnsi="標楷體" w:eastAsia="標楷體"/>
                 <w:b/>
                 <w:i w:val="0"/>
                 <w:color w:val="1E293B"/>
-                <w:sz w:val="17"/>
+                <w:sz w:val="32"/>
               </w:rPr>
               <w:t>Day 06</w:t>
             </w:r>
@@ -1644,11 +1644,11 @@
             </w:pPr>
             <w:r>
               <w:rPr>
-                <w:rFonts w:ascii="微軟正黑體" w:hAnsi="微軟正黑體" w:eastAsia="微軟正黑體"/>
+                <w:rFonts w:ascii="標楷體" w:hAnsi="標楷體" w:eastAsia="標楷體"/>
                 <w:b w:val="0"/>
                 <w:i w:val="0"/>
                 <w:color w:val="1E293B"/>
-                <w:sz w:val="17"/>
+                <w:sz w:val="32"/>
               </w:rPr>
               <w:t>10/12 (一)</w:t>
             </w:r>
@@ -1673,11 +1673,11 @@
             </w:pPr>
             <w:r>
               <w:rPr>
-                <w:rFonts w:ascii="微軟正黑體" w:hAnsi="微軟正黑體" w:eastAsia="微軟正黑體"/>
+                <w:rFonts w:ascii="標楷體" w:hAnsi="標楷體" w:eastAsia="標楷體"/>
                 <w:b w:val="0"/>
                 <w:i w:val="0"/>
                 <w:color w:val="1E293B"/>
-                <w:sz w:val="17"/>
+                <w:sz w:val="32"/>
               </w:rPr>
               <w:t>在校集訓</w:t>
             </w:r>
@@ -1702,11 +1702,11 @@
             </w:pPr>
             <w:r>
               <w:rPr>
-                <w:rFonts w:ascii="微軟正黑體" w:hAnsi="微軟正黑體" w:eastAsia="微軟正黑體"/>
+                <w:rFonts w:ascii="標楷體" w:hAnsi="標楷體" w:eastAsia="標楷體"/>
                 <w:b w:val="0"/>
                 <w:i w:val="0"/>
                 <w:color w:val="1E293B"/>
-                <w:sz w:val="17"/>
+                <w:sz w:val="32"/>
               </w:rPr>
               <w:t>第二段承接技巧：時間推移與空...</w:t>
             </w:r>
@@ -1731,11 +1731,11 @@
             </w:pPr>
             <w:r>
               <w:rPr>
-                <w:rFonts w:ascii="微軟正黑體" w:hAnsi="微軟正黑體" w:eastAsia="微軟正黑體"/>
+                <w:rFonts w:ascii="標楷體" w:hAnsi="標楷體" w:eastAsia="標楷體"/>
                 <w:b w:val="0"/>
                 <w:i w:val="0"/>
                 <w:color w:val="1E293B"/>
-                <w:sz w:val="17"/>
+                <w:sz w:val="32"/>
               </w:rPr>
               <w:t>晨間驗收週末 300 字作文。講解第二段承接技巧：善用時間詞（「清晨、午後、轉眼間」）或空間詞（「一走進四年丙班……」）。</w:t>
             </w:r>
@@ -1760,11 +1760,11 @@
             </w:pPr>
             <w:r>
               <w:rPr>
-                <w:rFonts w:ascii="微軟正黑體" w:hAnsi="微軟正黑體" w:eastAsia="微軟正黑體"/>
+                <w:rFonts w:ascii="標楷體" w:hAnsi="標楷體" w:eastAsia="標楷體"/>
                 <w:b w:val="0"/>
                 <w:i w:val="0"/>
                 <w:color w:val="1E293B"/>
-                <w:sz w:val="17"/>
+                <w:sz w:val="32"/>
               </w:rPr>
               <w:t>段落過渡自然流暢，時間或空間順序交代清晰，成功帶出核心事件起因。</w:t>
             </w:r>
@@ -1789,11 +1789,11 @@
             </w:pPr>
             <w:r>
               <w:rPr>
-                <w:rFonts w:ascii="微軟正黑體" w:hAnsi="微軟正黑體" w:eastAsia="微軟正黑體"/>
+                <w:rFonts w:ascii="標楷體" w:hAnsi="標楷體" w:eastAsia="標楷體"/>
                 <w:b w:val="0"/>
                 <w:i w:val="0"/>
                 <w:color w:val="1E293B"/>
-                <w:sz w:val="17"/>
+                <w:sz w:val="32"/>
               </w:rPr>
               <w:t>［ ］優</w:t>
               <w:br/>
@@ -1821,11 +1821,11 @@
             </w:pPr>
             <w:r>
               <w:rPr>
-                <w:rFonts w:ascii="微軟正黑體" w:hAnsi="微軟正黑體" w:eastAsia="微軟正黑體"/>
+                <w:rFonts w:ascii="標楷體" w:hAnsi="標楷體" w:eastAsia="標楷體"/>
                 <w:b/>
                 <w:i w:val="0"/>
                 <w:color w:val="1E293B"/>
-                <w:sz w:val="17"/>
+                <w:sz w:val="32"/>
               </w:rPr>
               <w:t>Day 07</w:t>
             </w:r>
@@ -1849,11 +1849,11 @@
             </w:pPr>
             <w:r>
               <w:rPr>
-                <w:rFonts w:ascii="微軟正黑體" w:hAnsi="微軟正黑體" w:eastAsia="微軟正黑體"/>
+                <w:rFonts w:ascii="標楷體" w:hAnsi="標楷體" w:eastAsia="標楷體"/>
                 <w:b w:val="0"/>
                 <w:i w:val="0"/>
                 <w:color w:val="1E293B"/>
-                <w:sz w:val="17"/>
+                <w:sz w:val="32"/>
               </w:rPr>
               <w:t>10/13 (二)</w:t>
             </w:r>
@@ -1877,11 +1877,11 @@
             </w:pPr>
             <w:r>
               <w:rPr>
-                <w:rFonts w:ascii="微軟正黑體" w:hAnsi="微軟正黑體" w:eastAsia="微軟正黑體"/>
+                <w:rFonts w:ascii="標楷體" w:hAnsi="標楷體" w:eastAsia="標楷體"/>
                 <w:b w:val="0"/>
                 <w:i w:val="0"/>
                 <w:color w:val="1E293B"/>
-                <w:sz w:val="17"/>
+                <w:sz w:val="32"/>
               </w:rPr>
               <w:t>在校集訓</w:t>
             </w:r>
@@ -1905,11 +1905,11 @@
             </w:pPr>
             <w:r>
               <w:rPr>
-                <w:rFonts w:ascii="微軟正黑體" w:hAnsi="微軟正黑體" w:eastAsia="微軟正黑體"/>
+                <w:rFonts w:ascii="標楷體" w:hAnsi="標楷體" w:eastAsia="標楷體"/>
                 <w:b w:val="0"/>
                 <w:i w:val="0"/>
                 <w:color w:val="1E293B"/>
-                <w:sz w:val="17"/>
+                <w:sz w:val="32"/>
               </w:rPr>
               <w:t>五感摹寫訓練 A：視覺描寫（...</w:t>
             </w:r>
@@ -1933,11 +1933,11 @@
             </w:pPr>
             <w:r>
               <w:rPr>
-                <w:rFonts w:ascii="微軟正黑體" w:hAnsi="微軟正黑體" w:eastAsia="微軟正黑體"/>
+                <w:rFonts w:ascii="標楷體" w:hAnsi="標楷體" w:eastAsia="標楷體"/>
                 <w:b w:val="0"/>
                 <w:i w:val="0"/>
                 <w:color w:val="1E293B"/>
-                <w:sz w:val="17"/>
+                <w:sz w:val="32"/>
               </w:rPr>
               <w:t>五感摹寫專題：視覺描寫。杜絕「很漂亮、很美麗」等空洞詞彙，改用精確的色彩（翠綠、鵝黃、湛藍）與動態詞（翻滾、掠過、閃爍）。</w:t>
             </w:r>
@@ -1961,11 +1961,11 @@
             </w:pPr>
             <w:r>
               <w:rPr>
-                <w:rFonts w:ascii="微軟正黑體" w:hAnsi="微軟正黑體" w:eastAsia="微軟正黑體"/>
+                <w:rFonts w:ascii="標楷體" w:hAnsi="標楷體" w:eastAsia="標楷體"/>
                 <w:b w:val="0"/>
                 <w:i w:val="0"/>
                 <w:color w:val="1E293B"/>
-                <w:sz w:val="17"/>
+                <w:sz w:val="32"/>
               </w:rPr>
               <w:t>能具體描繪事物的外形、色彩與動態變化，具有鮮明的畫面感。</w:t>
             </w:r>
@@ -1989,11 +1989,11 @@
             </w:pPr>
             <w:r>
               <w:rPr>
-                <w:rFonts w:ascii="微軟正黑體" w:hAnsi="微軟正黑體" w:eastAsia="微軟正黑體"/>
+                <w:rFonts w:ascii="標楷體" w:hAnsi="標楷體" w:eastAsia="標楷體"/>
                 <w:b w:val="0"/>
                 <w:i w:val="0"/>
                 <w:color w:val="1E293B"/>
-                <w:sz w:val="17"/>
+                <w:sz w:val="32"/>
               </w:rPr>
               <w:t>［ ］優</w:t>
               <w:br/>
@@ -2022,11 +2022,11 @@
             </w:pPr>
             <w:r>
               <w:rPr>
-                <w:rFonts w:ascii="微軟正黑體" w:hAnsi="微軟正黑體" w:eastAsia="微軟正黑體"/>
+                <w:rFonts w:ascii="標楷體" w:hAnsi="標楷體" w:eastAsia="標楷體"/>
                 <w:b/>
                 <w:i w:val="0"/>
                 <w:color w:val="1E293B"/>
-                <w:sz w:val="17"/>
+                <w:sz w:val="32"/>
               </w:rPr>
               <w:t>Day 08</w:t>
             </w:r>
@@ -2051,11 +2051,11 @@
             </w:pPr>
             <w:r>
               <w:rPr>
-                <w:rFonts w:ascii="微軟正黑體" w:hAnsi="微軟正黑體" w:eastAsia="微軟正黑體"/>
+                <w:rFonts w:ascii="標楷體" w:hAnsi="標楷體" w:eastAsia="標楷體"/>
                 <w:b w:val="0"/>
                 <w:i w:val="0"/>
                 <w:color w:val="1E293B"/>
-                <w:sz w:val="17"/>
+                <w:sz w:val="32"/>
               </w:rPr>
               <w:t>10/14 (三)</w:t>
             </w:r>
@@ -2080,11 +2080,11 @@
             </w:pPr>
             <w:r>
               <w:rPr>
-                <w:rFonts w:ascii="微軟正黑體" w:hAnsi="微軟正黑體" w:eastAsia="微軟正黑體"/>
+                <w:rFonts w:ascii="標楷體" w:hAnsi="標楷體" w:eastAsia="標楷體"/>
                 <w:b w:val="0"/>
                 <w:i w:val="0"/>
                 <w:color w:val="1E293B"/>
-                <w:sz w:val="17"/>
+                <w:sz w:val="32"/>
               </w:rPr>
               <w:t>在校集訓</w:t>
             </w:r>
@@ -2109,11 +2109,11 @@
             </w:pPr>
             <w:r>
               <w:rPr>
-                <w:rFonts w:ascii="微軟正黑體" w:hAnsi="微軟正黑體" w:eastAsia="微軟正黑體"/>
+                <w:rFonts w:ascii="標楷體" w:hAnsi="標楷體" w:eastAsia="標楷體"/>
                 <w:b w:val="0"/>
                 <w:i w:val="0"/>
                 <w:color w:val="1E293B"/>
-                <w:sz w:val="17"/>
+                <w:sz w:val="32"/>
               </w:rPr>
               <w:t>五感摹寫訓練 B：聽覺與觸覺...</w:t>
             </w:r>
@@ -2138,11 +2138,11 @@
             </w:pPr>
             <w:r>
               <w:rPr>
-                <w:rFonts w:ascii="微軟正黑體" w:hAnsi="微軟正黑體" w:eastAsia="微軟正黑體"/>
+                <w:rFonts w:ascii="標楷體" w:hAnsi="標楷體" w:eastAsia="標楷體"/>
                 <w:b w:val="0"/>
                 <w:i w:val="0"/>
                 <w:color w:val="1E293B"/>
-                <w:sz w:val="17"/>
+                <w:sz w:val="32"/>
               </w:rPr>
               <w:t>五感摹寫專題：聽覺與觸覺。引導學生捕捉環境中的微細聲音（擬聲詞：嘩啦啦、唧唧喳喳、砰砰跳）與觸覺感受（微風拂面、汗水滑落、掌心冰涼）。</w:t>
             </w:r>
@@ -2167,11 +2167,11 @@
             </w:pPr>
             <w:r>
               <w:rPr>
-                <w:rFonts w:ascii="微軟正黑體" w:hAnsi="微軟正黑體" w:eastAsia="微軟正黑體"/>
+                <w:rFonts w:ascii="標楷體" w:hAnsi="標楷體" w:eastAsia="標楷體"/>
                 <w:b w:val="0"/>
                 <w:i w:val="0"/>
                 <w:color w:val="1E293B"/>
-                <w:sz w:val="17"/>
+                <w:sz w:val="32"/>
               </w:rPr>
               <w:t>熟練運用擬聲詞與觸覺感受，能透過感官體驗映射主角當下的內心情緒。</w:t>
             </w:r>
@@ -2196,11 +2196,11 @@
             </w:pPr>
             <w:r>
               <w:rPr>
-                <w:rFonts w:ascii="微軟正黑體" w:hAnsi="微軟正黑體" w:eastAsia="微軟正黑體"/>
+                <w:rFonts w:ascii="標楷體" w:hAnsi="標楷體" w:eastAsia="標楷體"/>
                 <w:b w:val="0"/>
                 <w:i w:val="0"/>
                 <w:color w:val="1E293B"/>
-                <w:sz w:val="17"/>
+                <w:sz w:val="32"/>
               </w:rPr>
               <w:t>［ ］優</w:t>
               <w:br/>
@@ -2228,11 +2228,11 @@
             </w:pPr>
             <w:r>
               <w:rPr>
-                <w:rFonts w:ascii="微軟正黑體" w:hAnsi="微軟正黑體" w:eastAsia="微軟正黑體"/>
+                <w:rFonts w:ascii="標楷體" w:hAnsi="標楷體" w:eastAsia="標楷體"/>
                 <w:b/>
                 <w:i w:val="0"/>
                 <w:color w:val="1E293B"/>
-                <w:sz w:val="17"/>
+                <w:sz w:val="32"/>
               </w:rPr>
               <w:t>Day 09</w:t>
             </w:r>
@@ -2256,11 +2256,11 @@
             </w:pPr>
             <w:r>
               <w:rPr>
-                <w:rFonts w:ascii="微軟正黑體" w:hAnsi="微軟正黑體" w:eastAsia="微軟正黑體"/>
+                <w:rFonts w:ascii="標楷體" w:hAnsi="標楷體" w:eastAsia="標楷體"/>
                 <w:b w:val="0"/>
                 <w:i w:val="0"/>
                 <w:color w:val="1E293B"/>
-                <w:sz w:val="17"/>
+                <w:sz w:val="32"/>
               </w:rPr>
               <w:t>10/15 (四)</w:t>
             </w:r>
@@ -2284,11 +2284,11 @@
             </w:pPr>
             <w:r>
               <w:rPr>
-                <w:rFonts w:ascii="微軟正黑體" w:hAnsi="微軟正黑體" w:eastAsia="微軟正黑體"/>
+                <w:rFonts w:ascii="標楷體" w:hAnsi="標楷體" w:eastAsia="標楷體"/>
                 <w:b w:val="0"/>
                 <w:i w:val="0"/>
                 <w:color w:val="1E293B"/>
-                <w:sz w:val="17"/>
+                <w:sz w:val="32"/>
               </w:rPr>
               <w:t>在校集訓</w:t>
             </w:r>
@@ -2312,11 +2312,11 @@
             </w:pPr>
             <w:r>
               <w:rPr>
-                <w:rFonts w:ascii="微軟正黑體" w:hAnsi="微軟正黑體" w:eastAsia="微軟正黑體"/>
+                <w:rFonts w:ascii="標楷體" w:hAnsi="標楷體" w:eastAsia="標楷體"/>
                 <w:b w:val="0"/>
                 <w:i w:val="0"/>
                 <w:color w:val="1E293B"/>
-                <w:sz w:val="17"/>
+                <w:sz w:val="32"/>
               </w:rPr>
               <w:t>四年級必備修辭錦囊：排比句與...</w:t>
             </w:r>
@@ -2340,11 +2340,11 @@
             </w:pPr>
             <w:r>
               <w:rPr>
-                <w:rFonts w:ascii="微軟正黑體" w:hAnsi="微軟正黑體" w:eastAsia="微軟正黑體"/>
+                <w:rFonts w:ascii="標楷體" w:hAnsi="標楷體" w:eastAsia="標楷體"/>
                 <w:b w:val="0"/>
                 <w:i w:val="0"/>
                 <w:color w:val="1E293B"/>
-                <w:sz w:val="17"/>
+                <w:sz w:val="32"/>
               </w:rPr>
               <w:t>修辭技巧：比喻（明喻：甲像乙一樣）與排比（三個結構相同的分句）。比喻要有新意，排比要增強段落氣勢。</w:t>
             </w:r>
@@ -2368,11 +2368,11 @@
             </w:pPr>
             <w:r>
               <w:rPr>
-                <w:rFonts w:ascii="微軟正黑體" w:hAnsi="微軟正黑體" w:eastAsia="微軟正黑體"/>
+                <w:rFonts w:ascii="標楷體" w:hAnsi="標楷體" w:eastAsia="標楷體"/>
                 <w:b w:val="0"/>
                 <w:i w:val="0"/>
                 <w:color w:val="1E293B"/>
-                <w:sz w:val="17"/>
+                <w:sz w:val="32"/>
               </w:rPr>
               <w:t>能自主寫出一個新穎的比喻句與一個具節奏感的排比句，修辭自然不造作。</w:t>
             </w:r>
@@ -2396,11 +2396,11 @@
             </w:pPr>
             <w:r>
               <w:rPr>
-                <w:rFonts w:ascii="微軟正黑體" w:hAnsi="微軟正黑體" w:eastAsia="微軟正黑體"/>
+                <w:rFonts w:ascii="標楷體" w:hAnsi="標楷體" w:eastAsia="標楷體"/>
                 <w:b w:val="0"/>
                 <w:i w:val="0"/>
                 <w:color w:val="1E293B"/>
-                <w:sz w:val="17"/>
+                <w:sz w:val="32"/>
               </w:rPr>
               <w:t>［ ］優</w:t>
               <w:br/>
@@ -2429,11 +2429,11 @@
             </w:pPr>
             <w:r>
               <w:rPr>
-                <w:rFonts w:ascii="微軟正黑體" w:hAnsi="微軟正黑體" w:eastAsia="微軟正黑體"/>
+                <w:rFonts w:ascii="標楷體" w:hAnsi="標楷體" w:eastAsia="標楷體"/>
                 <w:b/>
                 <w:i w:val="0"/>
                 <w:color w:val="1E293B"/>
-                <w:sz w:val="17"/>
+                <w:sz w:val="32"/>
               </w:rPr>
               <w:t>Day 10</w:t>
             </w:r>
@@ -2458,11 +2458,11 @@
             </w:pPr>
             <w:r>
               <w:rPr>
-                <w:rFonts w:ascii="微軟正黑體" w:hAnsi="微軟正黑體" w:eastAsia="微軟正黑體"/>
+                <w:rFonts w:ascii="標楷體" w:hAnsi="標楷體" w:eastAsia="標楷體"/>
                 <w:b w:val="0"/>
                 <w:i w:val="0"/>
                 <w:color w:val="1E293B"/>
-                <w:sz w:val="17"/>
+                <w:sz w:val="32"/>
               </w:rPr>
               <w:t>10/16 (五)</w:t>
             </w:r>
@@ -2487,11 +2487,11 @@
             </w:pPr>
             <w:r>
               <w:rPr>
-                <w:rFonts w:ascii="微軟正黑體" w:hAnsi="微軟正黑體" w:eastAsia="微軟正黑體"/>
+                <w:rFonts w:ascii="標楷體" w:hAnsi="標楷體" w:eastAsia="標楷體"/>
                 <w:b w:val="0"/>
                 <w:i w:val="0"/>
                 <w:color w:val="1E293B"/>
-                <w:sz w:val="17"/>
+                <w:sz w:val="32"/>
               </w:rPr>
               <w:t>在校集訓</w:t>
             </w:r>
@@ -2516,11 +2516,11 @@
             </w:pPr>
             <w:r>
               <w:rPr>
-                <w:rFonts w:ascii="微軟正黑體" w:hAnsi="微軟正黑體" w:eastAsia="微軟正黑體"/>
+                <w:rFonts w:ascii="標楷體" w:hAnsi="標楷體" w:eastAsia="標楷體"/>
                 <w:b w:val="0"/>
                 <w:i w:val="0"/>
                 <w:color w:val="1E293B"/>
-                <w:sz w:val="17"/>
+                <w:sz w:val="32"/>
               </w:rPr>
               <w:t>第二段承接核心擴寫與第 2 ...</w:t>
             </w:r>
@@ -2545,11 +2545,11 @@
             </w:pPr>
             <w:r>
               <w:rPr>
-                <w:rFonts w:ascii="微軟正黑體" w:hAnsi="微軟正黑體" w:eastAsia="微軟正黑體"/>
+                <w:rFonts w:ascii="標楷體" w:hAnsi="標楷體" w:eastAsia="標楷體"/>
                 <w:b w:val="0"/>
                 <w:i w:val="0"/>
                 <w:color w:val="1E293B"/>
-                <w:sz w:val="17"/>
+                <w:sz w:val="32"/>
               </w:rPr>
               <w:t>第 2 週段落整合驗收：題目〈那一場精采的比賽〉，要求將五感摹寫（視、聽、觸）與比喻排比修辭融入第二段（150字）。</w:t>
             </w:r>
@@ -2574,11 +2574,11 @@
             </w:pPr>
             <w:r>
               <w:rPr>
-                <w:rFonts w:ascii="微軟正黑體" w:hAnsi="微軟正黑體" w:eastAsia="微軟正黑體"/>
+                <w:rFonts w:ascii="標楷體" w:hAnsi="標楷體" w:eastAsia="標楷體"/>
                 <w:b w:val="0"/>
                 <w:i w:val="0"/>
                 <w:color w:val="1E293B"/>
-                <w:sz w:val="17"/>
+                <w:sz w:val="32"/>
               </w:rPr>
               <w:t>第二段結構扎實，情節豐富，五感描寫生動，字數達 150~180 字。</w:t>
             </w:r>
@@ -2603,11 +2603,11 @@
             </w:pPr>
             <w:r>
               <w:rPr>
-                <w:rFonts w:ascii="微軟正黑體" w:hAnsi="微軟正黑體" w:eastAsia="微軟正黑體"/>
+                <w:rFonts w:ascii="標楷體" w:hAnsi="標楷體" w:eastAsia="標楷體"/>
                 <w:b w:val="0"/>
                 <w:i w:val="0"/>
                 <w:color w:val="1E293B"/>
-                <w:sz w:val="17"/>
+                <w:sz w:val="32"/>
               </w:rPr>
               <w:t>［ ］優</w:t>
               <w:br/>
@@ -2635,11 +2635,11 @@
             </w:pPr>
             <w:r>
               <w:rPr>
-                <w:rFonts w:ascii="微軟正黑體" w:hAnsi="微軟正黑體" w:eastAsia="微軟正黑體"/>
+                <w:rFonts w:ascii="標楷體" w:hAnsi="標楷體" w:eastAsia="標楷體"/>
                 <w:b/>
                 <w:i w:val="0"/>
                 <w:color w:val="1E293B"/>
-                <w:sz w:val="17"/>
+                <w:sz w:val="32"/>
               </w:rPr>
               <w:t>週末假日二</w:t>
             </w:r>
@@ -2663,11 +2663,11 @@
             </w:pPr>
             <w:r>
               <w:rPr>
-                <w:rFonts w:ascii="微軟正黑體" w:hAnsi="微軟正黑體" w:eastAsia="微軟正黑體"/>
+                <w:rFonts w:ascii="標楷體" w:hAnsi="標楷體" w:eastAsia="標楷體"/>
                 <w:b w:val="0"/>
                 <w:i w:val="0"/>
                 <w:color w:val="1E293B"/>
-                <w:sz w:val="17"/>
+                <w:sz w:val="32"/>
               </w:rPr>
               <w:t>10/17 (六) ~ 10/18 (日)</w:t>
             </w:r>
@@ -2691,11 +2691,11 @@
             </w:pPr>
             <w:r>
               <w:rPr>
-                <w:rFonts w:ascii="微軟正黑體" w:hAnsi="微軟正黑體" w:eastAsia="微軟正黑體"/>
+                <w:rFonts w:ascii="標楷體" w:hAnsi="標楷體" w:eastAsia="標楷體"/>
                 <w:b w:val="0"/>
                 <w:i w:val="0"/>
                 <w:color w:val="1E293B"/>
-                <w:sz w:val="17"/>
+                <w:sz w:val="32"/>
               </w:rPr>
               <w:t>假日自學增量</w:t>
             </w:r>
@@ -2719,11 +2719,11 @@
             </w:pPr>
             <w:r>
               <w:rPr>
-                <w:rFonts w:ascii="微軟正黑體" w:hAnsi="微軟正黑體" w:eastAsia="微軟正黑體"/>
+                <w:rFonts w:ascii="標楷體" w:hAnsi="標楷體" w:eastAsia="標楷體"/>
                 <w:b w:val="0"/>
                 <w:i w:val="0"/>
                 <w:color w:val="1E293B"/>
-                <w:sz w:val="17"/>
+                <w:sz w:val="32"/>
               </w:rPr>
               <w:t>【假日自主自學與作業增量】題...</w:t>
             </w:r>
@@ -2747,11 +2747,11 @@
             </w:pPr>
             <w:r>
               <w:rPr>
-                <w:rFonts w:ascii="微軟正黑體" w:hAnsi="微軟正黑體" w:eastAsia="微軟正黑體"/>
+                <w:rFonts w:ascii="標楷體" w:hAnsi="標楷體" w:eastAsia="標楷體"/>
                 <w:b w:val="0"/>
                 <w:i w:val="0"/>
                 <w:color w:val="1E293B"/>
-                <w:sz w:val="17"/>
+                <w:sz w:val="32"/>
               </w:rPr>
               <w:t>【週末停課改居家自學】指派中長篇寫作增量任務：將「起（情境開頭）＋承（雨中景象五感摹寫）＋轉（雨中送傘的意外感動）」前三段串聯。</w:t>
               <w:br/>
@@ -2777,11 +2777,11 @@
             </w:pPr>
             <w:r>
               <w:rPr>
-                <w:rFonts w:ascii="微軟正黑體" w:hAnsi="微軟正黑體" w:eastAsia="微軟正黑體"/>
+                <w:rFonts w:ascii="標楷體" w:hAnsi="標楷體" w:eastAsia="標楷體"/>
                 <w:b w:val="0"/>
                 <w:i w:val="0"/>
                 <w:color w:val="1E293B"/>
-                <w:sz w:val="17"/>
+                <w:sz w:val="32"/>
               </w:rPr>
               <w:t>【特優】：完成前三段 450 字連貫寫作，修辭標註精確，字體端正工整；【合格】：字數達標且家長簽章。</w:t>
             </w:r>
@@ -2805,11 +2805,11 @@
             </w:pPr>
             <w:r>
               <w:rPr>
-                <w:rFonts w:ascii="微軟正黑體" w:hAnsi="微軟正黑體" w:eastAsia="微軟正黑體"/>
+                <w:rFonts w:ascii="標楷體" w:hAnsi="標楷體" w:eastAsia="標楷體"/>
                 <w:b w:val="0"/>
                 <w:i w:val="0"/>
                 <w:color w:val="1E293B"/>
-                <w:sz w:val="17"/>
+                <w:sz w:val="32"/>
               </w:rPr>
               <w:t>［ ］優</w:t>
               <w:br/>
@@ -2838,11 +2838,11 @@
             </w:pPr>
             <w:r>
               <w:rPr>
-                <w:rFonts w:ascii="微軟正黑體" w:hAnsi="微軟正黑體" w:eastAsia="微軟正黑體"/>
+                <w:rFonts w:ascii="標楷體" w:hAnsi="標楷體" w:eastAsia="標楷體"/>
                 <w:b/>
                 <w:i w:val="0"/>
                 <w:color w:val="1E293B"/>
-                <w:sz w:val="17"/>
+                <w:sz w:val="32"/>
               </w:rPr>
               <w:t>Day 11</w:t>
             </w:r>
@@ -2867,11 +2867,11 @@
             </w:pPr>
             <w:r>
               <w:rPr>
-                <w:rFonts w:ascii="微軟正黑體" w:hAnsi="微軟正黑體" w:eastAsia="微軟正黑體"/>
+                <w:rFonts w:ascii="標楷體" w:hAnsi="標楷體" w:eastAsia="標楷體"/>
                 <w:b w:val="0"/>
                 <w:i w:val="0"/>
                 <w:color w:val="1E293B"/>
-                <w:sz w:val="17"/>
+                <w:sz w:val="32"/>
               </w:rPr>
               <w:t>10/19 (一)</w:t>
             </w:r>
@@ -2896,11 +2896,11 @@
             </w:pPr>
             <w:r>
               <w:rPr>
-                <w:rFonts w:ascii="微軟正黑體" w:hAnsi="微軟正黑體" w:eastAsia="微軟正黑體"/>
+                <w:rFonts w:ascii="標楷體" w:hAnsi="標楷體" w:eastAsia="標楷體"/>
                 <w:b w:val="0"/>
                 <w:i w:val="0"/>
                 <w:color w:val="1E293B"/>
-                <w:sz w:val="17"/>
+                <w:sz w:val="32"/>
               </w:rPr>
               <w:t>在校集訓</w:t>
             </w:r>
@@ -2925,11 +2925,11 @@
             </w:pPr>
             <w:r>
               <w:rPr>
-                <w:rFonts w:ascii="微軟正黑體" w:hAnsi="微軟正黑體" w:eastAsia="微軟正黑體"/>
+                <w:rFonts w:ascii="標楷體" w:hAnsi="標楷體" w:eastAsia="標楷體"/>
                 <w:b w:val="0"/>
                 <w:i w:val="0"/>
                 <w:color w:val="1E293B"/>
-                <w:sz w:val="17"/>
+                <w:sz w:val="32"/>
               </w:rPr>
               <w:t>第三段轉折技巧：製造波瀾與挫...</w:t>
             </w:r>
@@ -2954,11 +2954,11 @@
             </w:pPr>
             <w:r>
               <w:rPr>
-                <w:rFonts w:ascii="微軟正黑體" w:hAnsi="微軟正黑體" w:eastAsia="微軟正黑體"/>
+                <w:rFonts w:ascii="標楷體" w:hAnsi="標楷體" w:eastAsia="標楷體"/>
                 <w:b w:val="0"/>
                 <w:i w:val="0"/>
                 <w:color w:val="1E293B"/>
-                <w:sz w:val="17"/>
+                <w:sz w:val="32"/>
               </w:rPr>
               <w:t>晨間驗收週末 450 字作文。講解第三段轉折技巧：「文似看山不喜平」。記敘文最忌平鋪直敘，第三段必須出現「意想不到的困難、衝突、失敗或失落」，推動情節走向高潮。</w:t>
             </w:r>
@@ -2983,11 +2983,11 @@
             </w:pPr>
             <w:r>
               <w:rPr>
-                <w:rFonts w:ascii="微軟正黑體" w:hAnsi="微軟正黑體" w:eastAsia="微軟正黑體"/>
+                <w:rFonts w:ascii="標楷體" w:hAnsi="標楷體" w:eastAsia="標楷體"/>
                 <w:b w:val="0"/>
                 <w:i w:val="0"/>
                 <w:color w:val="1E293B"/>
-                <w:sz w:val="17"/>
+                <w:sz w:val="32"/>
               </w:rPr>
               <w:t>能成功設計合理的衝突或挫折點，打破平淡流水帳，引導情節產生戲劇張力。</w:t>
             </w:r>
@@ -3012,11 +3012,11 @@
             </w:pPr>
             <w:r>
               <w:rPr>
-                <w:rFonts w:ascii="微軟正黑體" w:hAnsi="微軟正黑體" w:eastAsia="微軟正黑體"/>
+                <w:rFonts w:ascii="標楷體" w:hAnsi="標楷體" w:eastAsia="標楷體"/>
                 <w:b w:val="0"/>
                 <w:i w:val="0"/>
                 <w:color w:val="1E293B"/>
-                <w:sz w:val="17"/>
+                <w:sz w:val="32"/>
               </w:rPr>
               <w:t>［ ］優</w:t>
               <w:br/>
@@ -3044,11 +3044,11 @@
             </w:pPr>
             <w:r>
               <w:rPr>
-                <w:rFonts w:ascii="微軟正黑體" w:hAnsi="微軟正黑體" w:eastAsia="微軟正黑體"/>
+                <w:rFonts w:ascii="標楷體" w:hAnsi="標楷體" w:eastAsia="標楷體"/>
                 <w:b/>
                 <w:i w:val="0"/>
                 <w:color w:val="1E293B"/>
-                <w:sz w:val="17"/>
+                <w:sz w:val="32"/>
               </w:rPr>
               <w:t>Day 12</w:t>
             </w:r>
@@ -3072,11 +3072,11 @@
             </w:pPr>
             <w:r>
               <w:rPr>
-                <w:rFonts w:ascii="微軟正黑體" w:hAnsi="微軟正黑體" w:eastAsia="微軟正黑體"/>
+                <w:rFonts w:ascii="標楷體" w:hAnsi="標楷體" w:eastAsia="標楷體"/>
                 <w:b w:val="0"/>
                 <w:i w:val="0"/>
                 <w:color w:val="1E293B"/>
-                <w:sz w:val="17"/>
+                <w:sz w:val="32"/>
               </w:rPr>
               <w:t>10/20 (二)</w:t>
             </w:r>
@@ -3100,11 +3100,11 @@
             </w:pPr>
             <w:r>
               <w:rPr>
-                <w:rFonts w:ascii="微軟正黑體" w:hAnsi="微軟正黑體" w:eastAsia="微軟正黑體"/>
+                <w:rFonts w:ascii="標楷體" w:hAnsi="標楷體" w:eastAsia="標楷體"/>
                 <w:b w:val="0"/>
                 <w:i w:val="0"/>
                 <w:color w:val="1E293B"/>
-                <w:sz w:val="17"/>
+                <w:sz w:val="32"/>
               </w:rPr>
               <w:t>在校集訓</w:t>
             </w:r>
@@ -3128,11 +3128,11 @@
             </w:pPr>
             <w:r>
               <w:rPr>
-                <w:rFonts w:ascii="微軟正黑體" w:hAnsi="微軟正黑體" w:eastAsia="微軟正黑體"/>
+                <w:rFonts w:ascii="標楷體" w:hAnsi="標楷體" w:eastAsia="標楷體"/>
                 <w:b w:val="0"/>
                 <w:i w:val="0"/>
                 <w:color w:val="1E293B"/>
-                <w:sz w:val="17"/>
+                <w:sz w:val="32"/>
               </w:rPr>
               <w:t>心境波瀾與心理獨白描寫...</w:t>
             </w:r>
@@ -3156,11 +3156,11 @@
             </w:pPr>
             <w:r>
               <w:rPr>
-                <w:rFonts w:ascii="微軟正黑體" w:hAnsi="微軟正黑體" w:eastAsia="微軟正黑體"/>
+                <w:rFonts w:ascii="標楷體" w:hAnsi="標楷體" w:eastAsia="標楷體"/>
                 <w:b w:val="0"/>
                 <w:i w:val="0"/>
                 <w:color w:val="1E293B"/>
-                <w:sz w:val="17"/>
+                <w:sz w:val="32"/>
               </w:rPr>
               <w:t>心理描寫專題：內心獨白法。讓主角在面對挫折時「心中默默自問自答」，展現真實的掙扎、猶豫到最後下定決心的心路歷程。</w:t>
             </w:r>
@@ -3184,11 +3184,11 @@
             </w:pPr>
             <w:r>
               <w:rPr>
-                <w:rFonts w:ascii="微軟正黑體" w:hAnsi="微軟正黑體" w:eastAsia="微軟正黑體"/>
+                <w:rFonts w:ascii="標楷體" w:hAnsi="標楷體" w:eastAsia="標楷體"/>
                 <w:b w:val="0"/>
                 <w:i w:val="0"/>
                 <w:color w:val="1E293B"/>
-                <w:sz w:val="17"/>
+                <w:sz w:val="32"/>
               </w:rPr>
               <w:t>能細緻刻畫主角心理轉變過程，心理獨白真摯自然，引發讀者共情。</w:t>
             </w:r>
@@ -3212,11 +3212,11 @@
             </w:pPr>
             <w:r>
               <w:rPr>
-                <w:rFonts w:ascii="微軟正黑體" w:hAnsi="微軟正黑體" w:eastAsia="微軟正黑體"/>
+                <w:rFonts w:ascii="標楷體" w:hAnsi="標楷體" w:eastAsia="標楷體"/>
                 <w:b w:val="0"/>
                 <w:i w:val="0"/>
                 <w:color w:val="1E293B"/>
-                <w:sz w:val="17"/>
+                <w:sz w:val="32"/>
               </w:rPr>
               <w:t>［ ］優</w:t>
               <w:br/>
@@ -3245,11 +3245,11 @@
             </w:pPr>
             <w:r>
               <w:rPr>
-                <w:rFonts w:ascii="微軟正黑體" w:hAnsi="微軟正黑體" w:eastAsia="微軟正黑體"/>
+                <w:rFonts w:ascii="標楷體" w:hAnsi="標楷體" w:eastAsia="標楷體"/>
                 <w:b/>
                 <w:i w:val="0"/>
                 <w:color w:val="1E293B"/>
-                <w:sz w:val="17"/>
+                <w:sz w:val="32"/>
               </w:rPr>
               <w:t>Day 13</w:t>
             </w:r>
@@ -3274,11 +3274,11 @@
             </w:pPr>
             <w:r>
               <w:rPr>
-                <w:rFonts w:ascii="微軟正黑體" w:hAnsi="微軟正黑體" w:eastAsia="微軟正黑體"/>
+                <w:rFonts w:ascii="標楷體" w:hAnsi="標楷體" w:eastAsia="標楷體"/>
                 <w:b w:val="0"/>
                 <w:i w:val="0"/>
                 <w:color w:val="1E293B"/>
-                <w:sz w:val="17"/>
+                <w:sz w:val="32"/>
               </w:rPr>
               <w:t>10/21 (三)</w:t>
             </w:r>
@@ -3303,11 +3303,11 @@
             </w:pPr>
             <w:r>
               <w:rPr>
-                <w:rFonts w:ascii="微軟正黑體" w:hAnsi="微軟正黑體" w:eastAsia="微軟正黑體"/>
+                <w:rFonts w:ascii="標楷體" w:hAnsi="標楷體" w:eastAsia="標楷體"/>
                 <w:b w:val="0"/>
                 <w:i w:val="0"/>
                 <w:color w:val="1E293B"/>
-                <w:sz w:val="17"/>
+                <w:sz w:val="32"/>
               </w:rPr>
               <w:t>在校集訓</w:t>
             </w:r>
@@ -3332,11 +3332,11 @@
             </w:pPr>
             <w:r>
               <w:rPr>
-                <w:rFonts w:ascii="微軟正黑體" w:hAnsi="微軟正黑體" w:eastAsia="微軟正黑體"/>
+                <w:rFonts w:ascii="標楷體" w:hAnsi="標楷體" w:eastAsia="標楷體"/>
                 <w:b w:val="0"/>
                 <w:i w:val="0"/>
                 <w:color w:val="1E293B"/>
-                <w:sz w:val="17"/>
+                <w:sz w:val="32"/>
               </w:rPr>
               <w:t>人物對話與神態動作特寫...</w:t>
             </w:r>
@@ -3361,11 +3361,11 @@
             </w:pPr>
             <w:r>
               <w:rPr>
-                <w:rFonts w:ascii="微軟正黑體" w:hAnsi="微軟正黑體" w:eastAsia="微軟正黑體"/>
+                <w:rFonts w:ascii="標楷體" w:hAnsi="標楷體" w:eastAsia="標楷體"/>
                 <w:b w:val="0"/>
                 <w:i w:val="0"/>
                 <w:color w:val="1E293B"/>
-                <w:sz w:val="17"/>
+                <w:sz w:val="32"/>
               </w:rPr>
               <w:t>描寫技巧：透過人物的「語言、神態、動作」三位一體展現性格。說話時的眼神、手部小動作、語氣語調。</w:t>
             </w:r>
@@ -3390,11 +3390,11 @@
             </w:pPr>
             <w:r>
               <w:rPr>
-                <w:rFonts w:ascii="微軟正黑體" w:hAnsi="微軟正黑體" w:eastAsia="微軟正黑體"/>
+                <w:rFonts w:ascii="標楷體" w:hAnsi="標楷體" w:eastAsia="標楷體"/>
                 <w:b w:val="0"/>
                 <w:i w:val="0"/>
                 <w:color w:val="1E293B"/>
-                <w:sz w:val="17"/>
+                <w:sz w:val="32"/>
               </w:rPr>
               <w:t>人物語言符合年齡身分，動作與神態描繪傳神，標點符號書寫規範無誤。</w:t>
             </w:r>
@@ -3419,11 +3419,11 @@
             </w:pPr>
             <w:r>
               <w:rPr>
-                <w:rFonts w:ascii="微軟正黑體" w:hAnsi="微軟正黑體" w:eastAsia="微軟正黑體"/>
+                <w:rFonts w:ascii="標楷體" w:hAnsi="標楷體" w:eastAsia="標楷體"/>
                 <w:b w:val="0"/>
                 <w:i w:val="0"/>
                 <w:color w:val="1E293B"/>
-                <w:sz w:val="17"/>
+                <w:sz w:val="32"/>
               </w:rPr>
               <w:t>［ ］優</w:t>
               <w:br/>
@@ -3451,11 +3451,11 @@
             </w:pPr>
             <w:r>
               <w:rPr>
-                <w:rFonts w:ascii="微軟正黑體" w:hAnsi="微軟正黑體" w:eastAsia="微軟正黑體"/>
+                <w:rFonts w:ascii="標楷體" w:hAnsi="標楷體" w:eastAsia="標楷體"/>
                 <w:b/>
                 <w:i w:val="0"/>
                 <w:color w:val="1E293B"/>
-                <w:sz w:val="17"/>
+                <w:sz w:val="32"/>
               </w:rPr>
               <w:t>Day 14</w:t>
             </w:r>
@@ -3479,11 +3479,11 @@
             </w:pPr>
             <w:r>
               <w:rPr>
-                <w:rFonts w:ascii="微軟正黑體" w:hAnsi="微軟正黑體" w:eastAsia="微軟正黑體"/>
+                <w:rFonts w:ascii="標楷體" w:hAnsi="標楷體" w:eastAsia="標楷體"/>
                 <w:b w:val="0"/>
                 <w:i w:val="0"/>
                 <w:color w:val="1E293B"/>
-                <w:sz w:val="17"/>
+                <w:sz w:val="32"/>
               </w:rPr>
               <w:t>10/22 (四)</w:t>
             </w:r>
@@ -3507,11 +3507,11 @@
             </w:pPr>
             <w:r>
               <w:rPr>
-                <w:rFonts w:ascii="微軟正黑體" w:hAnsi="微軟正黑體" w:eastAsia="微軟正黑體"/>
+                <w:rFonts w:ascii="標楷體" w:hAnsi="標楷體" w:eastAsia="標楷體"/>
                 <w:b w:val="0"/>
                 <w:i w:val="0"/>
                 <w:color w:val="1E293B"/>
-                <w:sz w:val="17"/>
+                <w:sz w:val="32"/>
               </w:rPr>
               <w:t>在校集訓</w:t>
             </w:r>
@@ -3535,11 +3535,11 @@
             </w:pPr>
             <w:r>
               <w:rPr>
-                <w:rFonts w:ascii="微軟正黑體" w:hAnsi="微軟正黑體" w:eastAsia="微軟正黑體"/>
+                <w:rFonts w:ascii="標楷體" w:hAnsi="標楷體" w:eastAsia="標楷體"/>
                 <w:b w:val="0"/>
                 <w:i w:val="0"/>
                 <w:color w:val="1E293B"/>
-                <w:sz w:val="17"/>
+                <w:sz w:val="32"/>
               </w:rPr>
               <w:t>第三段段落整合：突破困境與轉...</w:t>
             </w:r>
@@ -3563,11 +3563,11 @@
             </w:pPr>
             <w:r>
               <w:rPr>
-                <w:rFonts w:ascii="微軟正黑體" w:hAnsi="微軟正黑體" w:eastAsia="微軟正黑體"/>
+                <w:rFonts w:ascii="標楷體" w:hAnsi="標楷體" w:eastAsia="標楷體"/>
                 <w:b w:val="0"/>
                 <w:i w:val="0"/>
                 <w:color w:val="1E293B"/>
-                <w:sz w:val="17"/>
+                <w:sz w:val="32"/>
               </w:rPr>
               <w:t>第三段高潮整合：挫折之後如何找到轉機？朋友的幫助、一句話的點醒、或是內心的頓悟。情節由谷底向上攀升。</w:t>
             </w:r>
@@ -3591,11 +3591,11 @@
             </w:pPr>
             <w:r>
               <w:rPr>
-                <w:rFonts w:ascii="微軟正黑體" w:hAnsi="微軟正黑體" w:eastAsia="微軟正黑體"/>
+                <w:rFonts w:ascii="標楷體" w:hAnsi="標楷體" w:eastAsia="標楷體"/>
                 <w:b w:val="0"/>
                 <w:i w:val="0"/>
                 <w:color w:val="1E293B"/>
-                <w:sz w:val="17"/>
+                <w:sz w:val="32"/>
               </w:rPr>
               <w:t>情節波瀾起伏合理，從困境走向轉機的過程自然深刻，字數達 150 字。</w:t>
             </w:r>
@@ -3619,11 +3619,11 @@
             </w:pPr>
             <w:r>
               <w:rPr>
-                <w:rFonts w:ascii="微軟正黑體" w:hAnsi="微軟正黑體" w:eastAsia="微軟正黑體"/>
+                <w:rFonts w:ascii="標楷體" w:hAnsi="標楷體" w:eastAsia="標楷體"/>
                 <w:b w:val="0"/>
                 <w:i w:val="0"/>
                 <w:color w:val="1E293B"/>
-                <w:sz w:val="17"/>
+                <w:sz w:val="32"/>
               </w:rPr>
               <w:t>［ ］優</w:t>
               <w:br/>
@@ -3652,11 +3652,11 @@
             </w:pPr>
             <w:r>
               <w:rPr>
-                <w:rFonts w:ascii="微軟正黑體" w:hAnsi="微軟正黑體" w:eastAsia="微軟正黑體"/>
+                <w:rFonts w:ascii="標楷體" w:hAnsi="標楷體" w:eastAsia="標楷體"/>
                 <w:b/>
                 <w:i w:val="0"/>
                 <w:color w:val="1E293B"/>
-                <w:sz w:val="17"/>
+                <w:sz w:val="32"/>
               </w:rPr>
               <w:t>Day 15</w:t>
             </w:r>
@@ -3681,11 +3681,11 @@
             </w:pPr>
             <w:r>
               <w:rPr>
-                <w:rFonts w:ascii="微軟正黑體" w:hAnsi="微軟正黑體" w:eastAsia="微軟正黑體"/>
+                <w:rFonts w:ascii="標楷體" w:hAnsi="標楷體" w:eastAsia="標楷體"/>
                 <w:b w:val="0"/>
                 <w:i w:val="0"/>
                 <w:color w:val="1E293B"/>
-                <w:sz w:val="17"/>
+                <w:sz w:val="32"/>
               </w:rPr>
               <w:t>10/23 (五)</w:t>
             </w:r>
@@ -3710,11 +3710,11 @@
             </w:pPr>
             <w:r>
               <w:rPr>
-                <w:rFonts w:ascii="微軟正黑體" w:hAnsi="微軟正黑體" w:eastAsia="微軟正黑體"/>
+                <w:rFonts w:ascii="標楷體" w:hAnsi="標楷體" w:eastAsia="標楷體"/>
                 <w:b w:val="0"/>
                 <w:i w:val="0"/>
                 <w:color w:val="1E293B"/>
-                <w:sz w:val="17"/>
+                <w:sz w:val="32"/>
               </w:rPr>
               <w:t>在校集訓</w:t>
             </w:r>
@@ -3739,11 +3739,11 @@
             </w:pPr>
             <w:r>
               <w:rPr>
-                <w:rFonts w:ascii="微軟正黑體" w:hAnsi="微軟正黑體" w:eastAsia="微軟正黑體"/>
+                <w:rFonts w:ascii="標楷體" w:hAnsi="標楷體" w:eastAsia="標楷體"/>
                 <w:b w:val="0"/>
                 <w:i w:val="0"/>
                 <w:color w:val="1E293B"/>
-                <w:sz w:val="17"/>
+                <w:sz w:val="32"/>
               </w:rPr>
               <w:t>前三段連貫檢閱與第 3 週週...</w:t>
             </w:r>
@@ -3768,11 +3768,11 @@
             </w:pPr>
             <w:r>
               <w:rPr>
-                <w:rFonts w:ascii="微軟正黑體" w:hAnsi="微軟正黑體" w:eastAsia="微軟正黑體"/>
+                <w:rFonts w:ascii="標楷體" w:hAnsi="標楷體" w:eastAsia="標楷體"/>
                 <w:b w:val="0"/>
                 <w:i w:val="0"/>
                 <w:color w:val="1E293B"/>
-                <w:sz w:val="17"/>
+                <w:sz w:val="32"/>
               </w:rPr>
               <w:t>第 3 週綜合檢閱：評估起、承、轉前三段的連貫性。佈置週末全篇 600 字完整大作增量任務。</w:t>
             </w:r>
@@ -3797,11 +3797,11 @@
             </w:pPr>
             <w:r>
               <w:rPr>
-                <w:rFonts w:ascii="微軟正黑體" w:hAnsi="微軟正黑體" w:eastAsia="微軟正黑體"/>
+                <w:rFonts w:ascii="標楷體" w:hAnsi="標楷體" w:eastAsia="標楷體"/>
                 <w:b w:val="0"/>
                 <w:i w:val="0"/>
                 <w:color w:val="1E293B"/>
-                <w:sz w:val="17"/>
+                <w:sz w:val="32"/>
               </w:rPr>
               <w:t>起承轉三段結構完整，字數達 450 字以上，過渡句自然，無明顯邏輯漏洞。</w:t>
             </w:r>
@@ -3826,11 +3826,11 @@
             </w:pPr>
             <w:r>
               <w:rPr>
-                <w:rFonts w:ascii="微軟正黑體" w:hAnsi="微軟正黑體" w:eastAsia="微軟正黑體"/>
+                <w:rFonts w:ascii="標楷體" w:hAnsi="標楷體" w:eastAsia="標楷體"/>
                 <w:b w:val="0"/>
                 <w:i w:val="0"/>
                 <w:color w:val="1E293B"/>
-                <w:sz w:val="17"/>
+                <w:sz w:val="32"/>
               </w:rPr>
               <w:t>［ ］優</w:t>
               <w:br/>
@@ -3858,11 +3858,11 @@
             </w:pPr>
             <w:r>
               <w:rPr>
-                <w:rFonts w:ascii="微軟正黑體" w:hAnsi="微軟正黑體" w:eastAsia="微軟正黑體"/>
+                <w:rFonts w:ascii="標楷體" w:hAnsi="標楷體" w:eastAsia="標楷體"/>
                 <w:b/>
                 <w:i w:val="0"/>
                 <w:color w:val="1E293B"/>
-                <w:sz w:val="17"/>
+                <w:sz w:val="32"/>
               </w:rPr>
               <w:t>週末假日三</w:t>
             </w:r>
@@ -3886,11 +3886,11 @@
             </w:pPr>
             <w:r>
               <w:rPr>
-                <w:rFonts w:ascii="微軟正黑體" w:hAnsi="微軟正黑體" w:eastAsia="微軟正黑體"/>
+                <w:rFonts w:ascii="標楷體" w:hAnsi="標楷體" w:eastAsia="標楷體"/>
                 <w:b w:val="0"/>
                 <w:i w:val="0"/>
                 <w:color w:val="1E293B"/>
-                <w:sz w:val="17"/>
+                <w:sz w:val="32"/>
               </w:rPr>
               <w:t>10/24 (六) ~ 10/25 (日)</w:t>
             </w:r>
@@ -3914,11 +3914,11 @@
             </w:pPr>
             <w:r>
               <w:rPr>
-                <w:rFonts w:ascii="微軟正黑體" w:hAnsi="微軟正黑體" w:eastAsia="微軟正黑體"/>
+                <w:rFonts w:ascii="標楷體" w:hAnsi="標楷體" w:eastAsia="標楷體"/>
                 <w:b w:val="0"/>
                 <w:i w:val="0"/>
                 <w:color w:val="1E293B"/>
-                <w:sz w:val="17"/>
+                <w:sz w:val="32"/>
               </w:rPr>
               <w:t>假日自學增量</w:t>
             </w:r>
@@ -3942,11 +3942,11 @@
             </w:pPr>
             <w:r>
               <w:rPr>
-                <w:rFonts w:ascii="微軟正黑體" w:hAnsi="微軟正黑體" w:eastAsia="微軟正黑體"/>
+                <w:rFonts w:ascii="標楷體" w:hAnsi="標楷體" w:eastAsia="標楷體"/>
                 <w:b w:val="0"/>
                 <w:i w:val="0"/>
                 <w:color w:val="1E293B"/>
-                <w:sz w:val="17"/>
+                <w:sz w:val="32"/>
               </w:rPr>
               <w:t>【假日自主自學與作業增量】題...</w:t>
             </w:r>
@@ -3970,11 +3970,11 @@
             </w:pPr>
             <w:r>
               <w:rPr>
-                <w:rFonts w:ascii="微軟正黑體" w:hAnsi="微軟正黑體" w:eastAsia="微軟正黑體"/>
+                <w:rFonts w:ascii="標楷體" w:hAnsi="標楷體" w:eastAsia="標楷體"/>
                 <w:b w:val="0"/>
                 <w:i w:val="0"/>
                 <w:color w:val="1E293B"/>
-                <w:sz w:val="17"/>
+                <w:sz w:val="32"/>
               </w:rPr>
               <w:t>【週末停課改居家自學】指派高強度大篇幅增量任務：限時 60 分鐘，在標準四開稿紙上完整寫出一篇四段完整、滿 600 字的完整記敘文！</w:t>
               <w:br/>
@@ -4000,11 +4000,11 @@
             </w:pPr>
             <w:r>
               <w:rPr>
-                <w:rFonts w:ascii="微軟正黑體" w:hAnsi="微軟正黑體" w:eastAsia="微軟正黑體"/>
+                <w:rFonts w:ascii="標楷體" w:hAnsi="標楷體" w:eastAsia="標楷體"/>
                 <w:b w:val="0"/>
                 <w:i w:val="0"/>
                 <w:color w:val="1E293B"/>
-                <w:sz w:val="17"/>
+                <w:sz w:val="32"/>
               </w:rPr>
               <w:t>【特優】：60分鐘內寫滿 600~700 字，起承轉合完整，修辭優美，無立可白塗抹；【合格】：寫滿 600 字且家長簽章。</w:t>
             </w:r>
@@ -4028,11 +4028,11 @@
             </w:pPr>
             <w:r>
               <w:rPr>
-                <w:rFonts w:ascii="微軟正黑體" w:hAnsi="微軟正黑體" w:eastAsia="微軟正黑體"/>
+                <w:rFonts w:ascii="標楷體" w:hAnsi="標楷體" w:eastAsia="標楷體"/>
                 <w:b w:val="0"/>
                 <w:i w:val="0"/>
                 <w:color w:val="1E293B"/>
-                <w:sz w:val="17"/>
+                <w:sz w:val="32"/>
               </w:rPr>
               <w:t>［ ］優</w:t>
               <w:br/>
@@ -4061,11 +4061,11 @@
             </w:pPr>
             <w:r>
               <w:rPr>
-                <w:rFonts w:ascii="微軟正黑體" w:hAnsi="微軟正黑體" w:eastAsia="微軟正黑體"/>
+                <w:rFonts w:ascii="標楷體" w:hAnsi="標楷體" w:eastAsia="標楷體"/>
                 <w:b/>
                 <w:i w:val="0"/>
                 <w:color w:val="1E293B"/>
-                <w:sz w:val="17"/>
+                <w:sz w:val="32"/>
               </w:rPr>
               <w:t>Day 16</w:t>
             </w:r>
@@ -4090,11 +4090,11 @@
             </w:pPr>
             <w:r>
               <w:rPr>
-                <w:rFonts w:ascii="微軟正黑體" w:hAnsi="微軟正黑體" w:eastAsia="微軟正黑體"/>
+                <w:rFonts w:ascii="標楷體" w:hAnsi="標楷體" w:eastAsia="標楷體"/>
                 <w:b w:val="0"/>
                 <w:i w:val="0"/>
                 <w:color w:val="1E293B"/>
-                <w:sz w:val="17"/>
+                <w:sz w:val="32"/>
               </w:rPr>
               <w:t>10/26 (一)</w:t>
             </w:r>
@@ -4119,11 +4119,11 @@
             </w:pPr>
             <w:r>
               <w:rPr>
-                <w:rFonts w:ascii="微軟正黑體" w:hAnsi="微軟正黑體" w:eastAsia="微軟正黑體"/>
+                <w:rFonts w:ascii="標楷體" w:hAnsi="標楷體" w:eastAsia="標楷體"/>
                 <w:b w:val="0"/>
                 <w:i w:val="0"/>
                 <w:color w:val="1E293B"/>
-                <w:sz w:val="17"/>
+                <w:sz w:val="32"/>
               </w:rPr>
               <w:t>在校集訓</w:t>
             </w:r>
@@ -4148,11 +4148,11 @@
             </w:pPr>
             <w:r>
               <w:rPr>
-                <w:rFonts w:ascii="微軟正黑體" w:hAnsi="微軟正黑體" w:eastAsia="微軟正黑體"/>
+                <w:rFonts w:ascii="標楷體" w:hAnsi="標楷體" w:eastAsia="標楷體"/>
                 <w:b w:val="0"/>
                 <w:i w:val="0"/>
                 <w:color w:val="1E293B"/>
-                <w:sz w:val="17"/>
+                <w:sz w:val="32"/>
               </w:rPr>
               <w:t>第四段結尾技巧 A：首尾呼應...</w:t>
             </w:r>
@@ -4177,11 +4177,11 @@
             </w:pPr>
             <w:r>
               <w:rPr>
-                <w:rFonts w:ascii="微軟正黑體" w:hAnsi="微軟正黑體" w:eastAsia="微軟正黑體"/>
+                <w:rFonts w:ascii="標楷體" w:hAnsi="標楷體" w:eastAsia="標楷體"/>
                 <w:b w:val="0"/>
                 <w:i w:val="0"/>
                 <w:color w:val="1E293B"/>
-                <w:sz w:val="17"/>
+                <w:sz w:val="32"/>
               </w:rPr>
               <w:t>晨間驗收週末 600 字全篇作文。第四段結尾技巧：首尾呼應法。在結尾再次點出開頭提到的景物、人物或關鍵句，使整篇文章形成一個完美的圓環結構。</w:t>
             </w:r>
@@ -4206,11 +4206,11 @@
             </w:pPr>
             <w:r>
               <w:rPr>
-                <w:rFonts w:ascii="微軟正黑體" w:hAnsi="微軟正黑體" w:eastAsia="微軟正黑體"/>
+                <w:rFonts w:ascii="標楷體" w:hAnsi="標楷體" w:eastAsia="標楷體"/>
                 <w:b w:val="0"/>
                 <w:i w:val="0"/>
                 <w:color w:val="1E293B"/>
-                <w:sz w:val="17"/>
+                <w:sz w:val="32"/>
               </w:rPr>
               <w:t>結尾能巧妙呼應首段關鍵詞句，總結全文，結構嚴密圓融。</w:t>
             </w:r>
@@ -4235,11 +4235,11 @@
             </w:pPr>
             <w:r>
               <w:rPr>
-                <w:rFonts w:ascii="微軟正黑體" w:hAnsi="微軟正黑體" w:eastAsia="微軟正黑體"/>
+                <w:rFonts w:ascii="標楷體" w:hAnsi="標楷體" w:eastAsia="標楷體"/>
                 <w:b w:val="0"/>
                 <w:i w:val="0"/>
                 <w:color w:val="1E293B"/>
-                <w:sz w:val="17"/>
+                <w:sz w:val="32"/>
               </w:rPr>
               <w:t>［ ］優</w:t>
               <w:br/>
@@ -4267,11 +4267,11 @@
             </w:pPr>
             <w:r>
               <w:rPr>
-                <w:rFonts w:ascii="微軟正黑體" w:hAnsi="微軟正黑體" w:eastAsia="微軟正黑體"/>
+                <w:rFonts w:ascii="標楷體" w:hAnsi="標楷體" w:eastAsia="標楷體"/>
                 <w:b/>
                 <w:i w:val="0"/>
                 <w:color w:val="1E293B"/>
-                <w:sz w:val="17"/>
+                <w:sz w:val="32"/>
               </w:rPr>
               <w:t>Day 17</w:t>
             </w:r>
@@ -4295,11 +4295,11 @@
             </w:pPr>
             <w:r>
               <w:rPr>
-                <w:rFonts w:ascii="微軟正黑體" w:hAnsi="微軟正黑體" w:eastAsia="微軟正黑體"/>
+                <w:rFonts w:ascii="標楷體" w:hAnsi="標楷體" w:eastAsia="標楷體"/>
                 <w:b w:val="0"/>
                 <w:i w:val="0"/>
                 <w:color w:val="1E293B"/>
-                <w:sz w:val="17"/>
+                <w:sz w:val="32"/>
               </w:rPr>
               <w:t>10/27 (二)</w:t>
             </w:r>
@@ -4323,11 +4323,11 @@
             </w:pPr>
             <w:r>
               <w:rPr>
-                <w:rFonts w:ascii="微軟正黑體" w:hAnsi="微軟正黑體" w:eastAsia="微軟正黑體"/>
+                <w:rFonts w:ascii="標楷體" w:hAnsi="標楷體" w:eastAsia="標楷體"/>
                 <w:b w:val="0"/>
                 <w:i w:val="0"/>
                 <w:color w:val="1E293B"/>
-                <w:sz w:val="17"/>
+                <w:sz w:val="32"/>
               </w:rPr>
               <w:t>在校集訓</w:t>
             </w:r>
@@ -4351,11 +4351,11 @@
             </w:pPr>
             <w:r>
               <w:rPr>
-                <w:rFonts w:ascii="微軟正黑體" w:hAnsi="微軟正黑體" w:eastAsia="微軟正黑體"/>
+                <w:rFonts w:ascii="標楷體" w:hAnsi="標楷體" w:eastAsia="標楷體"/>
                 <w:b w:val="0"/>
                 <w:i w:val="0"/>
                 <w:color w:val="1E293B"/>
-                <w:sz w:val="17"/>
+                <w:sz w:val="32"/>
               </w:rPr>
               <w:t>第四段結尾技巧 B：領悟昇華...</w:t>
             </w:r>
@@ -4379,11 +4379,11 @@
             </w:pPr>
             <w:r>
               <w:rPr>
-                <w:rFonts w:ascii="微軟正黑體" w:hAnsi="微軟正黑體" w:eastAsia="微軟正黑體"/>
+                <w:rFonts w:ascii="標楷體" w:hAnsi="標楷體" w:eastAsia="標楷體"/>
                 <w:b w:val="0"/>
                 <w:i w:val="0"/>
                 <w:color w:val="1E293B"/>
-                <w:sz w:val="17"/>
+                <w:sz w:val="32"/>
               </w:rPr>
               <w:t>第四段結尾技巧：啟發昇華法。不要只停留在「我今天很開心」，而是寫出從這件事中學到的深刻人生哲理或自我期許，以金句點睛收筆。</w:t>
             </w:r>
@@ -4407,11 +4407,11 @@
             </w:pPr>
             <w:r>
               <w:rPr>
-                <w:rFonts w:ascii="微軟正黑體" w:hAnsi="微軟正黑體" w:eastAsia="微軟正黑體"/>
+                <w:rFonts w:ascii="標楷體" w:hAnsi="標楷體" w:eastAsia="標楷體"/>
                 <w:b w:val="0"/>
                 <w:i w:val="0"/>
                 <w:color w:val="1E293B"/>
-                <w:sz w:val="17"/>
+                <w:sz w:val="32"/>
               </w:rPr>
               <w:t>結尾立意高遠深刻，富有啟發性，金句鏗鏘有力，令人回味無窮。</w:t>
             </w:r>
@@ -4435,11 +4435,11 @@
             </w:pPr>
             <w:r>
               <w:rPr>
-                <w:rFonts w:ascii="微軟正黑體" w:hAnsi="微軟正黑體" w:eastAsia="微軟正黑體"/>
+                <w:rFonts w:ascii="標楷體" w:hAnsi="標楷體" w:eastAsia="標楷體"/>
                 <w:b w:val="0"/>
                 <w:i w:val="0"/>
                 <w:color w:val="1E293B"/>
-                <w:sz w:val="17"/>
+                <w:sz w:val="32"/>
               </w:rPr>
               <w:t>［ ］優</w:t>
               <w:br/>
@@ -4468,11 +4468,11 @@
             </w:pPr>
             <w:r>
               <w:rPr>
-                <w:rFonts w:ascii="微軟正黑體" w:hAnsi="微軟正黑體" w:eastAsia="微軟正黑體"/>
+                <w:rFonts w:ascii="標楷體" w:hAnsi="標楷體" w:eastAsia="標楷體"/>
                 <w:b/>
                 <w:i w:val="0"/>
                 <w:color w:val="1E293B"/>
-                <w:sz w:val="17"/>
+                <w:sz w:val="32"/>
               </w:rPr>
               <w:t>Day 18</w:t>
             </w:r>
@@ -4497,11 +4497,11 @@
             </w:pPr>
             <w:r>
               <w:rPr>
-                <w:rFonts w:ascii="微軟正黑體" w:hAnsi="微軟正黑體" w:eastAsia="微軟正黑體"/>
+                <w:rFonts w:ascii="標楷體" w:hAnsi="標楷體" w:eastAsia="標楷體"/>
                 <w:b w:val="0"/>
                 <w:i w:val="0"/>
                 <w:color w:val="1E293B"/>
-                <w:sz w:val="17"/>
+                <w:sz w:val="32"/>
               </w:rPr>
               <w:t>10/28 (三)</w:t>
             </w:r>
@@ -4526,11 +4526,11 @@
             </w:pPr>
             <w:r>
               <w:rPr>
-                <w:rFonts w:ascii="微軟正黑體" w:hAnsi="微軟正黑體" w:eastAsia="微軟正黑體"/>
+                <w:rFonts w:ascii="標楷體" w:hAnsi="標楷體" w:eastAsia="標楷體"/>
                 <w:b w:val="0"/>
                 <w:i w:val="0"/>
                 <w:color w:val="1E293B"/>
-                <w:sz w:val="17"/>
+                <w:sz w:val="32"/>
               </w:rPr>
               <w:t>在校集訓</w:t>
             </w:r>
@@ -4555,11 +4555,11 @@
             </w:pPr>
             <w:r>
               <w:rPr>
-                <w:rFonts w:ascii="微軟正黑體" w:hAnsi="微軟正黑體" w:eastAsia="微軟正黑體"/>
+                <w:rFonts w:ascii="標楷體" w:hAnsi="標楷體" w:eastAsia="標楷體"/>
                 <w:b w:val="0"/>
                 <w:i w:val="0"/>
                 <w:color w:val="1E293B"/>
-                <w:sz w:val="17"/>
+                <w:sz w:val="32"/>
               </w:rPr>
               <w:t>稿紙規格、標點符號與卷面書寫...</w:t>
             </w:r>
@@ -4584,11 +4584,11 @@
             </w:pPr>
             <w:r>
               <w:rPr>
-                <w:rFonts w:ascii="微軟正黑體" w:hAnsi="微軟正黑體" w:eastAsia="微軟正黑體"/>
+                <w:rFonts w:ascii="標楷體" w:hAnsi="標楷體" w:eastAsia="標楷體"/>
                 <w:b w:val="0"/>
                 <w:i w:val="0"/>
                 <w:color w:val="1E293B"/>
-                <w:sz w:val="17"/>
+                <w:sz w:val="32"/>
               </w:rPr>
               <w:t>考前規範專題：1. 每段開頭空兩格；2. 標點符號占一格，嚴禁點在行首第一格；3. 嚴禁使用修正液/帶；4. 劃線刪除規範。</w:t>
             </w:r>
@@ -4613,11 +4613,11 @@
             </w:pPr>
             <w:r>
               <w:rPr>
-                <w:rFonts w:ascii="微軟正黑體" w:hAnsi="微軟正黑體" w:eastAsia="微軟正黑體"/>
+                <w:rFonts w:ascii="標楷體" w:hAnsi="標楷體" w:eastAsia="標楷體"/>
                 <w:b w:val="0"/>
                 <w:i w:val="0"/>
                 <w:color w:val="1E293B"/>
-                <w:sz w:val="17"/>
+                <w:sz w:val="32"/>
               </w:rPr>
               <w:t>稿紙格式百分之百正確，字體工整無塗改，標點符號使用精確規範。</w:t>
             </w:r>
@@ -4642,11 +4642,11 @@
             </w:pPr>
             <w:r>
               <w:rPr>
-                <w:rFonts w:ascii="微軟正黑體" w:hAnsi="微軟正黑體" w:eastAsia="微軟正黑體"/>
+                <w:rFonts w:ascii="標楷體" w:hAnsi="標楷體" w:eastAsia="標楷體"/>
                 <w:b w:val="0"/>
                 <w:i w:val="0"/>
                 <w:color w:val="1E293B"/>
-                <w:sz w:val="17"/>
+                <w:sz w:val="32"/>
               </w:rPr>
               <w:t>［ ］優</w:t>
               <w:br/>
@@ -4674,11 +4674,11 @@
             </w:pPr>
             <w:r>
               <w:rPr>
-                <w:rFonts w:ascii="微軟正黑體" w:hAnsi="微軟正黑體" w:eastAsia="微軟正黑體"/>
+                <w:rFonts w:ascii="標楷體" w:hAnsi="標楷體" w:eastAsia="標楷體"/>
                 <w:b/>
                 <w:i w:val="0"/>
                 <w:color w:val="1E293B"/>
-                <w:sz w:val="17"/>
+                <w:sz w:val="32"/>
               </w:rPr>
               <w:t>Day 19</w:t>
             </w:r>
@@ -4702,11 +4702,11 @@
             </w:pPr>
             <w:r>
               <w:rPr>
-                <w:rFonts w:ascii="微軟正黑體" w:hAnsi="微軟正黑體" w:eastAsia="微軟正黑體"/>
+                <w:rFonts w:ascii="標楷體" w:hAnsi="標楷體" w:eastAsia="標楷體"/>
                 <w:b w:val="0"/>
                 <w:i w:val="0"/>
                 <w:color w:val="1E293B"/>
-                <w:sz w:val="17"/>
+                <w:sz w:val="32"/>
               </w:rPr>
               <w:t>10/29 (四)</w:t>
             </w:r>
@@ -4730,11 +4730,11 @@
             </w:pPr>
             <w:r>
               <w:rPr>
-                <w:rFonts w:ascii="微軟正黑體" w:hAnsi="微軟正黑體" w:eastAsia="微軟正黑體"/>
+                <w:rFonts w:ascii="標楷體" w:hAnsi="標楷體" w:eastAsia="標楷體"/>
                 <w:b w:val="0"/>
                 <w:i w:val="0"/>
                 <w:color w:val="1E293B"/>
-                <w:sz w:val="17"/>
+                <w:sz w:val="32"/>
               </w:rPr>
               <w:t>在校集訓</w:t>
             </w:r>
@@ -4758,11 +4758,11 @@
             </w:pPr>
             <w:r>
               <w:rPr>
-                <w:rFonts w:ascii="微軟正黑體" w:hAnsi="微軟正黑體" w:eastAsia="微軟正黑體"/>
+                <w:rFonts w:ascii="標楷體" w:hAnsi="標楷體" w:eastAsia="標楷體"/>
                 <w:b w:val="0"/>
                 <w:i w:val="0"/>
                 <w:color w:val="1E293B"/>
-                <w:sz w:val="17"/>
+                <w:sz w:val="32"/>
               </w:rPr>
               <w:t>90 分鐘時間精準配速與應急...</w:t>
             </w:r>
@@ -4786,11 +4786,11 @@
             </w:pPr>
             <w:r>
               <w:rPr>
-                <w:rFonts w:ascii="微軟正黑體" w:hAnsi="微軟正黑體" w:eastAsia="微軟正黑體"/>
+                <w:rFonts w:ascii="標楷體" w:hAnsi="標楷體" w:eastAsia="標楷體"/>
                 <w:b w:val="0"/>
                 <w:i w:val="0"/>
                 <w:color w:val="1E293B"/>
-                <w:sz w:val="17"/>
+                <w:sz w:val="32"/>
               </w:rPr>
               <w:t>90 分鐘實戰策略：前 10 分鐘審題大綱；中間 65 分鐘動筆書寫 600~800 字；後 15 分鐘逐行檢查。傳授卡筆應急術。</w:t>
             </w:r>
@@ -4814,11 +4814,11 @@
             </w:pPr>
             <w:r>
               <w:rPr>
-                <w:rFonts w:ascii="微軟正黑體" w:hAnsi="微軟正黑體" w:eastAsia="微軟正黑體"/>
+                <w:rFonts w:ascii="標楷體" w:hAnsi="標楷體" w:eastAsia="標楷體"/>
                 <w:b w:val="0"/>
                 <w:i w:val="0"/>
                 <w:color w:val="1E293B"/>
-                <w:sz w:val="17"/>
+                <w:sz w:val="32"/>
               </w:rPr>
               <w:t>充分理解 90 分鐘作答時間分配，具備冷靜應對突發卡筆與時間壓力的心理素質。</w:t>
             </w:r>
@@ -4842,11 +4842,11 @@
             </w:pPr>
             <w:r>
               <w:rPr>
-                <w:rFonts w:ascii="微軟正黑體" w:hAnsi="微軟正黑體" w:eastAsia="微軟正黑體"/>
+                <w:rFonts w:ascii="標楷體" w:hAnsi="標楷體" w:eastAsia="標楷體"/>
                 <w:b w:val="0"/>
                 <w:i w:val="0"/>
                 <w:color w:val="1E293B"/>
-                <w:sz w:val="17"/>
+                <w:sz w:val="32"/>
               </w:rPr>
               <w:t>［ ］優</w:t>
               <w:br/>
@@ -4875,11 +4875,11 @@
             </w:pPr>
             <w:r>
               <w:rPr>
-                <w:rFonts w:ascii="微軟正黑體" w:hAnsi="微軟正黑體" w:eastAsia="微軟正黑體"/>
+                <w:rFonts w:ascii="標楷體" w:hAnsi="標楷體" w:eastAsia="標楷體"/>
                 <w:b/>
                 <w:i w:val="0"/>
                 <w:color w:val="1E293B"/>
-                <w:sz w:val="17"/>
+                <w:sz w:val="32"/>
               </w:rPr>
               <w:t>Day 20</w:t>
             </w:r>
@@ -4904,11 +4904,11 @@
             </w:pPr>
             <w:r>
               <w:rPr>
-                <w:rFonts w:ascii="微軟正黑體" w:hAnsi="微軟正黑體" w:eastAsia="微軟正黑體"/>
+                <w:rFonts w:ascii="標楷體" w:hAnsi="標楷體" w:eastAsia="標楷體"/>
                 <w:b w:val="0"/>
                 <w:i w:val="0"/>
                 <w:color w:val="1E293B"/>
-                <w:sz w:val="17"/>
+                <w:sz w:val="32"/>
               </w:rPr>
               <w:t>10/30 (五)</w:t>
             </w:r>
@@ -4933,11 +4933,11 @@
             </w:pPr>
             <w:r>
               <w:rPr>
-                <w:rFonts w:ascii="微軟正黑體" w:hAnsi="微軟正黑體" w:eastAsia="微軟正黑體"/>
+                <w:rFonts w:ascii="標楷體" w:hAnsi="標楷體" w:eastAsia="標楷體"/>
                 <w:b w:val="0"/>
                 <w:i w:val="0"/>
                 <w:color w:val="1E293B"/>
-                <w:sz w:val="17"/>
+                <w:sz w:val="32"/>
               </w:rPr>
               <w:t>在校集訓</w:t>
             </w:r>
@@ -4962,11 +4962,11 @@
             </w:pPr>
             <w:r>
               <w:rPr>
-                <w:rFonts w:ascii="微軟正黑體" w:hAnsi="微軟正黑體" w:eastAsia="微軟正黑體"/>
+                <w:rFonts w:ascii="標楷體" w:hAnsi="標楷體" w:eastAsia="標楷體"/>
                 <w:b w:val="0"/>
                 <w:i w:val="0"/>
                 <w:color w:val="1E293B"/>
-                <w:sz w:val="17"/>
+                <w:sz w:val="32"/>
               </w:rPr>
               <w:t>賽前 90 分鐘全真模擬考（...</w:t>
             </w:r>
@@ -4991,11 +4991,11 @@
             </w:pPr>
             <w:r>
               <w:rPr>
-                <w:rFonts w:ascii="微軟正黑體" w:hAnsi="微軟正黑體" w:eastAsia="微軟正黑體"/>
+                <w:rFonts w:ascii="標楷體" w:hAnsi="標楷體" w:eastAsia="標楷體"/>
                 <w:b w:val="0"/>
                 <w:i w:val="0"/>
                 <w:color w:val="1E293B"/>
-                <w:sz w:val="17"/>
+                <w:sz w:val="32"/>
               </w:rPr>
               <w:t>全真模擬考：限時 90 分鐘（08:20 - 09:50）。現場公布題目〈那一次，我戰勝了自己〉。發放標準四開稿紙，完全比照校內賽規格實施。</w:t>
             </w:r>
@@ -5020,11 +5020,11 @@
             </w:pPr>
             <w:r>
               <w:rPr>
-                <w:rFonts w:ascii="微軟正黑體" w:hAnsi="微軟正黑體" w:eastAsia="微軟正黑體"/>
+                <w:rFonts w:ascii="標楷體" w:hAnsi="標楷體" w:eastAsia="標楷體"/>
                 <w:b w:val="0"/>
                 <w:i w:val="0"/>
                 <w:color w:val="1E293B"/>
-                <w:sz w:val="17"/>
+                <w:sz w:val="32"/>
               </w:rPr>
               <w:t>能在 90 分鐘內寫滿 600~800 字，結構四段完整，立意深刻，字體端正，展現四年丙班選手最佳水準！</w:t>
             </w:r>
@@ -5049,11 +5049,11 @@
             </w:pPr>
             <w:r>
               <w:rPr>
-                <w:rFonts w:ascii="微軟正黑體" w:hAnsi="微軟正黑體" w:eastAsia="微軟正黑體"/>
+                <w:rFonts w:ascii="標楷體" w:hAnsi="標楷體" w:eastAsia="標楷體"/>
                 <w:b w:val="0"/>
                 <w:i w:val="0"/>
                 <w:color w:val="1E293B"/>
-                <w:sz w:val="17"/>
+                <w:sz w:val="32"/>
               </w:rPr>
               <w:t>［ ］優</w:t>
               <w:br/>
@@ -5081,11 +5081,11 @@
             </w:pPr>
             <w:r>
               <w:rPr>
-                <w:rFonts w:ascii="微軟正黑體" w:hAnsi="微軟正黑體" w:eastAsia="微軟正黑體"/>
+                <w:rFonts w:ascii="標楷體" w:hAnsi="標楷體" w:eastAsia="標楷體"/>
                 <w:b/>
                 <w:i w:val="0"/>
                 <w:color w:val="1E293B"/>
-                <w:sz w:val="17"/>
+                <w:sz w:val="32"/>
               </w:rPr>
               <w:t>週末假日四</w:t>
             </w:r>
@@ -5109,11 +5109,11 @@
             </w:pPr>
             <w:r>
               <w:rPr>
-                <w:rFonts w:ascii="微軟正黑體" w:hAnsi="微軟正黑體" w:eastAsia="微軟正黑體"/>
+                <w:rFonts w:ascii="標楷體" w:hAnsi="標楷體" w:eastAsia="標楷體"/>
                 <w:b w:val="0"/>
                 <w:i w:val="0"/>
                 <w:color w:val="1E293B"/>
-                <w:sz w:val="17"/>
+                <w:sz w:val="32"/>
               </w:rPr>
               <w:t>10/31 (六) ~ 11/01 (日)</w:t>
             </w:r>
@@ -5137,11 +5137,11 @@
             </w:pPr>
             <w:r>
               <w:rPr>
-                <w:rFonts w:ascii="微軟正黑體" w:hAnsi="微軟正黑體" w:eastAsia="微軟正黑體"/>
+                <w:rFonts w:ascii="標楷體" w:hAnsi="標楷體" w:eastAsia="標楷體"/>
                 <w:b w:val="0"/>
                 <w:i w:val="0"/>
                 <w:color w:val="1E293B"/>
-                <w:sz w:val="17"/>
+                <w:sz w:val="32"/>
               </w:rPr>
               <w:t>假日自學增量</w:t>
             </w:r>
@@ -5165,11 +5165,11 @@
             </w:pPr>
             <w:r>
               <w:rPr>
-                <w:rFonts w:ascii="微軟正黑體" w:hAnsi="微軟正黑體" w:eastAsia="微軟正黑體"/>
+                <w:rFonts w:ascii="標楷體" w:hAnsi="標楷體" w:eastAsia="標楷體"/>
                 <w:b w:val="0"/>
                 <w:i w:val="0"/>
                 <w:color w:val="1E293B"/>
-                <w:sz w:val="17"/>
+                <w:sz w:val="32"/>
               </w:rPr>
               <w:t>【賽前黃金週末極限自學與作業...</w:t>
             </w:r>
@@ -5193,11 +5193,11 @@
             </w:pPr>
             <w:r>
               <w:rPr>
-                <w:rFonts w:ascii="微軟正黑體" w:hAnsi="微軟正黑體" w:eastAsia="微軟正黑體"/>
+                <w:rFonts w:ascii="標楷體" w:hAnsi="標楷體" w:eastAsia="標楷體"/>
                 <w:b w:val="0"/>
                 <w:i w:val="0"/>
                 <w:color w:val="1E293B"/>
-                <w:sz w:val="17"/>
+                <w:sz w:val="32"/>
               </w:rPr>
               <w:t>【賽前黃金週末自學指引】比賽倒數 4 天！指示選手在家完全比照正式競賽，週六上午 08:20~09:50 嚴格計時 90 分鐘書寫全篇稿紙一次。</w:t>
               <w:br/>
@@ -5223,11 +5223,11 @@
             </w:pPr>
             <w:r>
               <w:rPr>
-                <w:rFonts w:ascii="微軟正黑體" w:hAnsi="微軟正黑體" w:eastAsia="微軟正黑體"/>
+                <w:rFonts w:ascii="標楷體" w:hAnsi="標楷體" w:eastAsia="標楷體"/>
                 <w:b w:val="0"/>
                 <w:i w:val="0"/>
                 <w:color w:val="1E293B"/>
-                <w:sz w:val="17"/>
+                <w:sz w:val="32"/>
               </w:rPr>
               <w:t>【特優】：90分鐘內完卷，字數達 650~750 字，起承轉合完美，字跡清秀工整。</w:t>
             </w:r>
@@ -5251,11 +5251,11 @@
             </w:pPr>
             <w:r>
               <w:rPr>
-                <w:rFonts w:ascii="微軟正黑體" w:hAnsi="微軟正黑體" w:eastAsia="微軟正黑體"/>
+                <w:rFonts w:ascii="標楷體" w:hAnsi="標楷體" w:eastAsia="標楷體"/>
                 <w:b w:val="0"/>
                 <w:i w:val="0"/>
                 <w:color w:val="1E293B"/>
-                <w:sz w:val="17"/>
+                <w:sz w:val="32"/>
               </w:rPr>
               <w:t>［ ］優</w:t>
               <w:br/>
@@ -5643,6 +5643,10 @@
     <w:name w:val="Normal"/>
     <w:qFormat/>
     <w:rsid w:val="00FC693F"/>
+    <w:rPr>
+      <w:rFonts w:ascii="標楷體" w:hAnsi="標楷體" w:eastAsia="標楷體"/>
+      <w:sz w:val="32"/>
+    </w:rPr>
   </w:style>
   <w:style w:type="paragraph" w:styleId="Header">
     <w:name w:val="header"/>

</xml_diff>